<commit_message>
Add Sprint 3 regression suite and out-of-date test case list
Sprint-3_Regression.xlsx retests 164 cases across 39 stories, split by
tester, with a 20-step smoke run through the Sprint 3 goal. 30 selected
cases whose story workbooks no longer match the app (SPM-93 removed
booking slots; SPM-88 made confirmation wait for the safety check) are
rewritten on their own sheet and were run against a copy of the
database. A separate sheet lists all 83 out-of-date cases with the
story that changed them, and Follow-ups has one update per story owner.

The guide covers the new sheets, the Sprint 3 smoke run and checks,
and how to handle out-of-date cases; the Word copy is regenerated.

Co-Authored-By: Claude Opus 5.5 <noreply@anthropic.com>
</commit_message>
<xml_diff>
--- a/docs/Regression_Testing_Guide.docx
+++ b/docs/Regression_Testing_Guide.docx
@@ -110,14 +110,13 @@
           <w:b/>
           <w:bCs/>
         </w:rPr>
-        <w:t xml:space="preserve">Never run</w:t>
-      </w:r>
-      <w:r>
-        <w:t xml:space="preserve"> </w:t>
-      </w:r>
-      <w:r>
-        <w:rPr>
-          <w:rFonts w:ascii="Consolas" w:cs="Consolas" w:eastAsia="Consolas" w:hAnsi="Consolas"/>
+        <w:t xml:space="preserve">Never run </w:t>
+      </w:r>
+      <w:r>
+        <w:rPr>
+          <w:rFonts w:ascii="Consolas" w:cs="Consolas" w:eastAsia="Consolas" w:hAnsi="Consolas"/>
+          <w:b/>
+          <w:bCs/>
           <w:sz w:val="20"/>
           <w:szCs w:val="20"/>
         </w:rPr>
@@ -163,7 +162,7 @@
     </w:p>
     <w:p>
       <w:pPr>
-        <w:shd w:fill="F2F2F2" w:val="clear"/>
+        <w:shd w:fill="F2F2F2" w:color="auto" w:val="clear"/>
         <w:spacing w:after="0" w:before="80"/>
         <w:ind w:left="200" w:right="200"/>
       </w:pPr>
@@ -178,7 +177,7 @@
     </w:p>
     <w:p>
       <w:pPr>
-        <w:shd w:fill="F2F2F2" w:val="clear"/>
+        <w:shd w:fill="F2F2F2" w:color="auto" w:val="clear"/>
         <w:spacing w:after="0" w:before="0"/>
         <w:ind w:left="200" w:right="200"/>
       </w:pPr>
@@ -193,7 +192,7 @@
     </w:p>
     <w:p>
       <w:pPr>
-        <w:shd w:fill="F2F2F2" w:val="clear"/>
+        <w:shd w:fill="F2F2F2" w:color="auto" w:val="clear"/>
         <w:spacing w:after="0" w:before="0"/>
         <w:ind w:left="200" w:right="200"/>
       </w:pPr>
@@ -208,7 +207,7 @@
     </w:p>
     <w:p>
       <w:pPr>
-        <w:shd w:fill="F2F2F2" w:val="clear"/>
+        <w:shd w:fill="F2F2F2" w:color="auto" w:val="clear"/>
         <w:spacing w:after="0" w:before="0"/>
         <w:ind w:left="200" w:right="200"/>
       </w:pPr>
@@ -223,7 +222,7 @@
     </w:p>
     <w:p>
       <w:pPr>
-        <w:shd w:fill="F2F2F2" w:val="clear"/>
+        <w:shd w:fill="F2F2F2" w:color="auto" w:val="clear"/>
         <w:spacing w:after="0" w:before="0"/>
         <w:ind w:left="200" w:right="200"/>
       </w:pPr>
@@ -238,8 +237,8 @@
     </w:p>
     <w:p>
       <w:pPr>
-        <w:shd w:fill="F2F2F2" w:val="clear"/>
-        <w:spacing w:after="200" w:before="0"/>
+        <w:shd w:fill="F2F2F2" w:color="auto" w:val="clear"/>
+        <w:spacing w:after="0" w:before="0"/>
         <w:ind w:left="200" w:right="200"/>
       </w:pPr>
       <w:r>
@@ -253,6 +252,21 @@
     </w:p>
     <w:p>
       <w:pPr>
+        <w:shd w:fill="F2F2F2" w:color="auto" w:val="clear"/>
+        <w:spacing w:after="160" w:before="0"/>
+        <w:ind w:left="200" w:right="200"/>
+      </w:pPr>
+      <w:r>
+        <w:rPr>
+          <w:rFonts w:ascii="Consolas" w:cs="Consolas" w:eastAsia="Consolas" w:hAnsi="Consolas"/>
+          <w:sz w:val="18"/>
+          <w:szCs w:val="18"/>
+        </w:rPr>
+        <w:t xml:space="preserve">npm run test-cases:check</w:t>
+      </w:r>
+    </w:p>
+    <w:p>
+      <w:pPr>
         <w:spacing w:after="140"/>
       </w:pPr>
       <w:r>
@@ -272,7 +286,7 @@
     </w:p>
     <w:p>
       <w:pPr>
-        <w:shd w:fill="F2F2F2" w:val="clear"/>
+        <w:shd w:fill="F2F2F2" w:color="auto" w:val="clear"/>
         <w:spacing w:after="0" w:before="80"/>
         <w:ind w:left="200" w:right="200"/>
       </w:pPr>
@@ -287,8 +301,8 @@
     </w:p>
     <w:p>
       <w:pPr>
-        <w:shd w:fill="F2F2F2" w:val="clear"/>
-        <w:spacing w:after="200" w:before="0"/>
+        <w:shd w:fill="F2F2F2" w:color="auto" w:val="clear"/>
+        <w:spacing w:after="160" w:before="0"/>
         <w:ind w:left="200" w:right="200"/>
       </w:pPr>
       <w:r>
@@ -305,7 +319,15 @@
         <w:spacing w:after="140"/>
       </w:pPr>
       <w:r>
-        <w:t xml:space="preserve">All five must pass before any manual testing. A failure here is a regression: handle it as in step 7, then start again from this step.</w:t>
+        <w:t xml:space="preserve">Also check that CI is green on GitHub for the commit you are testing. CI runs the end-to-end smoke tests, which refuse to run against the shared database.</w:t>
+      </w:r>
+    </w:p>
+    <w:p>
+      <w:pPr>
+        <w:spacing w:after="140"/>
+      </w:pPr>
+      <w:r>
+        <w:t xml:space="preserve">All of them must pass before any manual testing. A failure here is a regression: handle it as in step 7, then start again from this step.</w:t>
       </w:r>
     </w:p>
     <w:p>
@@ -326,8 +348,8 @@
     </w:p>
     <w:p>
       <w:pPr>
-        <w:shd w:fill="F2F2F2" w:val="clear"/>
-        <w:spacing w:after="200" w:before="80"/>
+        <w:shd w:fill="F2F2F2" w:color="auto" w:val="clear"/>
+        <w:spacing w:after="160" w:before="80"/>
         <w:ind w:left="200" w:right="200"/>
       </w:pPr>
       <w:r>
@@ -360,8 +382,8 @@
     </w:p>
     <w:p>
       <w:pPr>
-        <w:shd w:fill="F2F2F2" w:val="clear"/>
-        <w:spacing w:after="200" w:before="80"/>
+        <w:shd w:fill="F2F2F2" w:color="auto" w:val="clear"/>
+        <w:spacing w:after="160" w:before="80"/>
         <w:ind w:left="200" w:right="200"/>
       </w:pPr>
       <w:r>
@@ -394,8 +416,8 @@
     </w:p>
     <w:p>
       <w:pPr>
-        <w:shd w:fill="F2F2F2" w:val="clear"/>
-        <w:spacing w:after="200" w:before="80"/>
+        <w:shd w:fill="F2F2F2" w:color="auto" w:val="clear"/>
+        <w:spacing w:after="160" w:before="80"/>
         <w:ind w:left="200" w:right="200"/>
       </w:pPr>
       <w:r>
@@ -522,20 +544,19 @@
       <w:r>
         <w:rPr>
           <w:rFonts w:ascii="Consolas" w:cs="Consolas" w:eastAsia="Consolas" w:hAnsi="Consolas"/>
+          <w:b/>
+          <w:bCs/>
           <w:sz w:val="20"/>
           <w:szCs w:val="20"/>
         </w:rPr>
         <w:t xml:space="preserve">code_references</w:t>
       </w:r>
       <w:r>
-        <w:t xml:space="preserve"> </w:t>
-      </w:r>
-      <w:r>
         <w:rPr>
           <w:b/>
           <w:bCs/>
         </w:rPr>
-        <w:t xml:space="preserve">is not complete.</w:t>
+        <w:t xml:space="preserve"> is not complete.</w:t>
       </w:r>
       <w:r>
         <w:t xml:space="preserve"> If you know a change affects a screen that an earlier story uses, add that story even if the search missed it.</w:t>
@@ -642,28 +663,17 @@
         <w:spacing w:after="140"/>
       </w:pPr>
       <w:r>
-        <w:t xml:space="preserve">Write the selected case IDs into the regression log before you start, so the scope is fixed before the results come in.</w:t>
-      </w:r>
-    </w:p>
-    <w:p>
-      <w:pPr>
-        <w:pStyle w:val="Heading1"/>
-      </w:pPr>
-      <w:r>
-        <w:t xml:space="preserve">Step 4: Prepare the test data</w:t>
-      </w:r>
-    </w:p>
-    <w:p>
-      <w:pPr>
-        <w:pStyle w:val="ListParagraph"/>
-        <w:numPr>
-          <w:ilvl w:val="0"/>
-          <w:numId w:val="3"/>
-        </w:numPr>
-        <w:spacing w:after="80"/>
-      </w:pPr>
-      <w:r>
-        <w:t xml:space="preserve">If a story in scope has a fixture script (</w:t>
+        <w:t xml:space="preserve">Before the run, check whether a story finished this sprint changed on purpose what a selected case expects. For example, a case that ticks booking slots that no longer exist, or one that expects a refusal message that now reads differently. Do not edit the story's test case files for this. Rewrite the case on the log's </w:t>
+      </w:r>
+      <w:r>
+        <w:rPr>
+          <w:b/>
+          <w:bCs/>
+        </w:rPr>
+        <w:t xml:space="preserve">Rewritten cases</w:t>
+      </w:r>
+      <w:r>
+        <w:t xml:space="preserve"> sheet, give it the same ID with </w:t>
       </w:r>
       <w:r>
         <w:rPr>
@@ -671,10 +681,49 @@
           <w:sz w:val="20"/>
           <w:szCs w:val="20"/>
         </w:rPr>
-        <w:t xml:space="preserve">npm run fixtures:spm&lt;NN&gt;</w:t>
-      </w:r>
-      <w:r>
-        <w:t xml:space="preserve">, listed in </w:t>
+        <w:t xml:space="preserve">-R</w:t>
+      </w:r>
+      <w:r>
+        <w:t xml:space="preserve"> on the end, and run it on a copy of the database before the regression run, so its expected results come from the screen. List every out-of-date case, selected or not, on the </w:t>
+      </w:r>
+      <w:r>
+        <w:rPr>
+          <w:b/>
+          <w:bCs/>
+        </w:rPr>
+        <w:t xml:space="preserve">Out-of-date cases</w:t>
+      </w:r>
+      <w:r>
+        <w:t xml:space="preserve"> sheet with the story that changed it. The story's owner updates the test case files afterwards (step 6).</w:t>
+      </w:r>
+    </w:p>
+    <w:p>
+      <w:pPr>
+        <w:spacing w:after="140"/>
+      </w:pPr>
+      <w:r>
+        <w:t xml:space="preserve">Write the selected case IDs into the regression log before you start, so the scope is fixed before the results come in.</w:t>
+      </w:r>
+    </w:p>
+    <w:p>
+      <w:pPr>
+        <w:pStyle w:val="Heading1"/>
+      </w:pPr>
+      <w:r>
+        <w:t xml:space="preserve">Step 4: Prepare the test data</w:t>
+      </w:r>
+    </w:p>
+    <w:p>
+      <w:pPr>
+        <w:pStyle w:val="ListParagraph"/>
+        <w:numPr>
+          <w:ilvl w:val="0"/>
+          <w:numId w:val="3"/>
+        </w:numPr>
+        <w:spacing w:after="80"/>
+      </w:pPr>
+      <w:r>
+        <w:t xml:space="preserve">If a story in scope has a fixture script (</w:t>
       </w:r>
       <w:r>
         <w:rPr>
@@ -682,23 +731,10 @@
           <w:sz w:val="20"/>
           <w:szCs w:val="20"/>
         </w:rPr>
-        <w:t xml:space="preserve">package.json</w:t>
-      </w:r>
-      <w:r>
-        <w:t xml:space="preserve">), run it before testing that story, and again after any case that changes data. The case's preconditions say when.</w:t>
-      </w:r>
-    </w:p>
-    <w:p>
-      <w:pPr>
-        <w:pStyle w:val="ListParagraph"/>
-        <w:numPr>
-          <w:ilvl w:val="0"/>
-          <w:numId w:val="3"/>
-        </w:numPr>
-        <w:spacing w:after="80"/>
-      </w:pPr>
-      <w:r>
-        <w:t xml:space="preserve">Stories without a fixture script use the base seed data. If a precondition no longer matches what is in the database, record the case as </w:t>
+        <w:t xml:space="preserve">npm run fixtures:spm&lt;NN&gt;</w:t>
+      </w:r>
+      <w:r>
+        <w:t xml:space="preserve">, listed in </w:t>
       </w:r>
       <w:r>
         <w:rPr>
@@ -706,6 +742,30 @@
           <w:sz w:val="20"/>
           <w:szCs w:val="20"/>
         </w:rPr>
+        <w:t xml:space="preserve">package.json</w:t>
+      </w:r>
+      <w:r>
+        <w:t xml:space="preserve">), run it before testing that story, and again after any case that changes data. The case's preconditions say when.</w:t>
+      </w:r>
+    </w:p>
+    <w:p>
+      <w:pPr>
+        <w:pStyle w:val="ListParagraph"/>
+        <w:numPr>
+          <w:ilvl w:val="0"/>
+          <w:numId w:val="3"/>
+        </w:numPr>
+        <w:spacing w:after="80"/>
+      </w:pPr>
+      <w:r>
+        <w:t xml:space="preserve">Stories without a fixture script use the base seed data. If a precondition no longer matches what is in the database, record the case as </w:t>
+      </w:r>
+      <w:r>
+        <w:rPr>
+          <w:rFonts w:ascii="Consolas" w:cs="Consolas" w:eastAsia="Consolas" w:hAnsi="Consolas"/>
+          <w:sz w:val="20"/>
+          <w:szCs w:val="20"/>
+        </w:rPr>
         <w:t xml:space="preserve">Blocked</w:t>
       </w:r>
       <w:r>
@@ -758,7 +818,17 @@
         <w:t xml:space="preserve">REG S&lt;N&gt; &lt;your name&gt;</w:t>
       </w:r>
       <w:r>
-        <w:t xml:space="preserve">, so no story's fixtures are touched. As of sprint 2 the flow is:</w:t>
+        <w:t xml:space="preserve">, so no story's fixtures are touched. The tracker's </w:t>
+      </w:r>
+      <w:r>
+        <w:rPr>
+          <w:b/>
+          <w:bCs/>
+        </w:rPr>
+        <w:t xml:space="preserve">Smoke run</w:t>
+      </w:r>
+      <w:r>
+        <w:t xml:space="preserve"> sheet has the accounts and what to check at each step. As of sprint 3 the flow is:</w:t>
       </w:r>
     </w:p>
     <w:p>
@@ -797,7 +867,7 @@
         <w:spacing w:after="80"/>
       </w:pPr>
       <w:r>
-        <w:t xml:space="preserve">Event Coordinator reviews and approves the request.</w:t>
+        <w:t xml:space="preserve">Event Coordinator reviews and approves the request, then begins planning.</w:t>
       </w:r>
     </w:p>
     <w:p>
@@ -810,7 +880,7 @@
         <w:spacing w:after="80"/>
       </w:pPr>
       <w:r>
-        <w:t xml:space="preserve">Event Coordinator begins planning, searches for a venue, checks its availability and submits a venue booking request.</w:t>
+        <w:t xml:space="preserve">Event Coordinator makes an ordinary edit to the event information.</w:t>
       </w:r>
     </w:p>
     <w:p>
@@ -823,6 +893,19 @@
         <w:spacing w:after="80"/>
       </w:pPr>
       <w:r>
+        <w:t xml:space="preserve">Event Coordinator searches for venues and requests two venues for the same times, each for its own purpose, attendance and layout.</w:t>
+      </w:r>
+    </w:p>
+    <w:p>
+      <w:pPr>
+        <w:pStyle w:val="ListParagraph"/>
+        <w:numPr>
+          <w:ilvl w:val="0"/>
+          <w:numId w:val="4"/>
+        </w:numPr>
+        <w:spacing w:after="80"/>
+      </w:pPr>
+      <w:r>
         <w:t xml:space="preserve">Event Coordinator records the equipment required.</w:t>
       </w:r>
     </w:p>
@@ -836,7 +919,7 @@
         <w:spacing w:after="80"/>
       </w:pPr>
       <w:r>
-        <w:t xml:space="preserve">Technical Support Staff checks equipment availability and reserves it.</w:t>
+        <w:t xml:space="preserve">Technical Support Staff checks equipment availability and reserves it, then marks an unrelated item under maintenance and returns it.</w:t>
       </w:r>
     </w:p>
     <w:p>
@@ -849,7 +932,150 @@
         <w:spacing w:after="80"/>
       </w:pPr>
       <w:r>
-        <w:t xml:space="preserve">Venue Staff opens the venue list, edits a venue and views its availability calendar.</w:t>
+        <w:t xml:space="preserve">Venue Staff approves both booking requests.</w:t>
+      </w:r>
+    </w:p>
+    <w:p>
+      <w:pPr>
+        <w:pStyle w:val="ListParagraph"/>
+        <w:numPr>
+          <w:ilvl w:val="0"/>
+          <w:numId w:val="4"/>
+        </w:numPr>
+        <w:spacing w:after="80"/>
+      </w:pPr>
+      <w:r>
+        <w:t xml:space="preserve">Venue Staff marks one of the two venues unavailable over the event's times.</w:t>
+      </w:r>
+    </w:p>
+    <w:p>
+      <w:pPr>
+        <w:pStyle w:val="ListParagraph"/>
+        <w:numPr>
+          <w:ilvl w:val="0"/>
+          <w:numId w:val="4"/>
+        </w:numPr>
+        <w:spacing w:after="80"/>
+      </w:pPr>
+      <w:r>
+        <w:t xml:space="preserve">Event Coordinator sees the notification and the flagged booking.</w:t>
+      </w:r>
+    </w:p>
+    <w:p>
+      <w:pPr>
+        <w:pStyle w:val="ListParagraph"/>
+        <w:numPr>
+          <w:ilvl w:val="0"/>
+          <w:numId w:val="4"/>
+        </w:numPr>
+        <w:spacing w:after="80"/>
+      </w:pPr>
+      <w:r>
+        <w:t xml:space="preserve">Event Coordinator requests a replacement venue and releases the flagged booking.</w:t>
+      </w:r>
+    </w:p>
+    <w:p>
+      <w:pPr>
+        <w:pStyle w:val="ListParagraph"/>
+        <w:numPr>
+          <w:ilvl w:val="0"/>
+          <w:numId w:val="4"/>
+        </w:numPr>
+        <w:spacing w:after="80"/>
+      </w:pPr>
+      <w:r>
+        <w:t xml:space="preserve">Venue Staff approves the replacement.</w:t>
+      </w:r>
+    </w:p>
+    <w:p>
+      <w:pPr>
+        <w:pStyle w:val="ListParagraph"/>
+        <w:numPr>
+          <w:ilvl w:val="0"/>
+          <w:numId w:val="4"/>
+        </w:numPr>
+        <w:spacing w:after="80"/>
+      </w:pPr>
+      <w:r>
+        <w:t xml:space="preserve">Event Coordinator sets up registration and tries to confirm the event, which is refused for the missing safety check.</w:t>
+      </w:r>
+    </w:p>
+    <w:p>
+      <w:pPr>
+        <w:pStyle w:val="ListParagraph"/>
+        <w:numPr>
+          <w:ilvl w:val="0"/>
+          <w:numId w:val="4"/>
+        </w:numPr>
+        <w:spacing w:after="80"/>
+      </w:pPr>
+      <w:r>
+        <w:t xml:space="preserve">Event Coordinator submits the event for a safety check.</w:t>
+      </w:r>
+    </w:p>
+    <w:p>
+      <w:pPr>
+        <w:pStyle w:val="ListParagraph"/>
+        <w:numPr>
+          <w:ilvl w:val="0"/>
+          <w:numId w:val="4"/>
+        </w:numPr>
+        <w:spacing w:after="80"/>
+      </w:pPr>
+      <w:r>
+        <w:t xml:space="preserve">Safety Officer requests changes.</w:t>
+      </w:r>
+    </w:p>
+    <w:p>
+      <w:pPr>
+        <w:pStyle w:val="ListParagraph"/>
+        <w:numPr>
+          <w:ilvl w:val="0"/>
+          <w:numId w:val="4"/>
+        </w:numPr>
+        <w:spacing w:after="80"/>
+      </w:pPr>
+      <w:r>
+        <w:t xml:space="preserve">Event Coordinator reads the decision and resubmits; the organiser cannot see the reason.</w:t>
+      </w:r>
+    </w:p>
+    <w:p>
+      <w:pPr>
+        <w:pStyle w:val="ListParagraph"/>
+        <w:numPr>
+          <w:ilvl w:val="0"/>
+          <w:numId w:val="4"/>
+        </w:numPr>
+        <w:spacing w:after="80"/>
+      </w:pPr>
+      <w:r>
+        <w:t xml:space="preserve">Safety Officer approves, and the Event Coordinator confirms the event.</w:t>
+      </w:r>
+    </w:p>
+    <w:p>
+      <w:pPr>
+        <w:pStyle w:val="ListParagraph"/>
+        <w:numPr>
+          <w:ilvl w:val="0"/>
+          <w:numId w:val="4"/>
+        </w:numPr>
+        <w:spacing w:after="80"/>
+      </w:pPr>
+      <w:r>
+        <w:t xml:space="preserve">An Attendee registers for the event, then withdraws.</w:t>
+      </w:r>
+    </w:p>
+    <w:p>
+      <w:pPr>
+        <w:pStyle w:val="ListParagraph"/>
+        <w:numPr>
+          <w:ilvl w:val="0"/>
+          <w:numId w:val="4"/>
+        </w:numPr>
+        <w:spacing w:after="80"/>
+      </w:pPr>
+      <w:r>
+        <w:t xml:space="preserve">The organiser and the coordinator see the withdrawal on the registration list.</w:t>
       </w:r>
     </w:p>
     <w:p>
@@ -933,8 +1159,8 @@
         </w:tblBorders>
       </w:tblPr>
       <w:tblGrid>
-        <w:gridCol w:w="2400"/>
-        <w:gridCol w:w="6626"/>
+        <w:gridCol w:w="1992"/>
+        <w:gridCol w:w="7034"/>
       </w:tblGrid>
       <w:tr>
         <w:trPr>
@@ -942,14 +1168,14 @@
         </w:trPr>
         <w:tc>
           <w:tcPr>
-            <w:tcW w:type="dxa" w:w="2400"/>
-            <w:tcBorders>
-              <w:top w:val="single" w:color="BFBFBF" w:sz="4"/>
-              <w:left w:val="single" w:color="BFBFBF" w:sz="4"/>
-              <w:bottom w:val="single" w:color="BFBFBF" w:sz="4"/>
-              <w:right w:val="single" w:color="BFBFBF" w:sz="4"/>
-            </w:tcBorders>
-            <w:shd w:fill="E7EEF7" w:val="clear"/>
+            <w:tcW w:type="dxa" w:w="1992"/>
+            <w:tcBorders>
+              <w:top w:val="single" w:color="BFBFBF" w:sz="4"/>
+              <w:left w:val="single" w:color="BFBFBF" w:sz="4"/>
+              <w:bottom w:val="single" w:color="BFBFBF" w:sz="4"/>
+              <w:right w:val="single" w:color="BFBFBF" w:sz="4"/>
+            </w:tcBorders>
+            <w:shd w:fill="E7EEF7" w:color="auto" w:val="clear"/>
             <w:tcMar>
               <w:top w:type="dxa" w:w="80"/>
               <w:left w:type="dxa" w:w="120"/>
@@ -969,14 +1195,14 @@
         </w:tc>
         <w:tc>
           <w:tcPr>
-            <w:tcW w:type="dxa" w:w="6626"/>
-            <w:tcBorders>
-              <w:top w:val="single" w:color="BFBFBF" w:sz="4"/>
-              <w:left w:val="single" w:color="BFBFBF" w:sz="4"/>
-              <w:bottom w:val="single" w:color="BFBFBF" w:sz="4"/>
-              <w:right w:val="single" w:color="BFBFBF" w:sz="4"/>
-            </w:tcBorders>
-            <w:shd w:fill="E7EEF7" w:val="clear"/>
+            <w:tcW w:type="dxa" w:w="7034"/>
+            <w:tcBorders>
+              <w:top w:val="single" w:color="BFBFBF" w:sz="4"/>
+              <w:left w:val="single" w:color="BFBFBF" w:sz="4"/>
+              <w:bottom w:val="single" w:color="BFBFBF" w:sz="4"/>
+              <w:right w:val="single" w:color="BFBFBF" w:sz="4"/>
+            </w:tcBorders>
+            <w:shd w:fill="E7EEF7" w:color="auto" w:val="clear"/>
             <w:tcMar>
               <w:top w:type="dxa" w:w="80"/>
               <w:left w:type="dxa" w:w="120"/>
@@ -996,9 +1222,12 @@
         </w:tc>
       </w:tr>
       <w:tr>
-        <w:tc>
-          <w:tcPr>
-            <w:tcW w:type="dxa" w:w="2400"/>
+        <w:trPr>
+          <w:tblHeader w:val="off"/>
+        </w:trPr>
+        <w:tc>
+          <w:tcPr>
+            <w:tcW w:type="dxa" w:w="1992"/>
             <w:tcBorders>
               <w:top w:val="single" w:color="BFBFBF" w:sz="4"/>
               <w:left w:val="single" w:color="BFBFBF" w:sz="4"/>
@@ -1020,7 +1249,7 @@
         </w:tc>
         <w:tc>
           <w:tcPr>
-            <w:tcW w:type="dxa" w:w="6626"/>
+            <w:tcW w:type="dxa" w:w="7034"/>
             <w:tcBorders>
               <w:top w:val="single" w:color="BFBFBF" w:sz="4"/>
               <w:left w:val="single" w:color="BFBFBF" w:sz="4"/>
@@ -1042,193 +1271,366 @@
         </w:tc>
       </w:tr>
       <w:tr>
-        <w:tc>
-          <w:tcPr>
-            <w:tcW w:type="dxa" w:w="2400"/>
-            <w:tcBorders>
-              <w:top w:val="single" w:color="BFBFBF" w:sz="4"/>
-              <w:left w:val="single" w:color="BFBFBF" w:sz="4"/>
-              <w:bottom w:val="single" w:color="BFBFBF" w:sz="4"/>
-              <w:right w:val="single" w:color="BFBFBF" w:sz="4"/>
-            </w:tcBorders>
-            <w:tcMar>
-              <w:top w:type="dxa" w:w="80"/>
-              <w:left w:type="dxa" w:w="120"/>
-              <w:bottom w:type="dxa" w:w="80"/>
-              <w:right w:type="dxa" w:w="120"/>
-            </w:tcMar>
-          </w:tcPr>
-          <w:p>
-            <w:r>
-              <w:t xml:space="preserve">Retested cases</w:t>
-            </w:r>
-          </w:p>
-        </w:tc>
-        <w:tc>
-          <w:tcPr>
-            <w:tcW w:type="dxa" w:w="6626"/>
-            <w:tcBorders>
-              <w:top w:val="single" w:color="BFBFBF" w:sz="4"/>
-              <w:left w:val="single" w:color="BFBFBF" w:sz="4"/>
-              <w:bottom w:val="single" w:color="BFBFBF" w:sz="4"/>
-              <w:right w:val="single" w:color="BFBFBF" w:sz="4"/>
-            </w:tcBorders>
-            <w:tcMar>
-              <w:top w:type="dxa" w:w="80"/>
-              <w:left w:type="dxa" w:w="120"/>
-              <w:bottom w:type="dxa" w:w="80"/>
-              <w:right w:type="dxa" w:w="120"/>
-            </w:tcMar>
-          </w:tcPr>
-          <w:p>
-            <w:r>
-              <w:t xml:space="preserve">One row per selected case: result, tester, date and notes.</w:t>
+        <w:trPr>
+          <w:tblHeader w:val="off"/>
+        </w:trPr>
+        <w:tc>
+          <w:tcPr>
+            <w:tcW w:type="dxa" w:w="1992"/>
+            <w:tcBorders>
+              <w:top w:val="single" w:color="BFBFBF" w:sz="4"/>
+              <w:left w:val="single" w:color="BFBFBF" w:sz="4"/>
+              <w:bottom w:val="single" w:color="BFBFBF" w:sz="4"/>
+              <w:right w:val="single" w:color="BFBFBF" w:sz="4"/>
+            </w:tcBorders>
+            <w:tcMar>
+              <w:top w:type="dxa" w:w="80"/>
+              <w:left w:type="dxa" w:w="120"/>
+              <w:bottom w:type="dxa" w:w="80"/>
+              <w:right w:type="dxa" w:w="120"/>
+            </w:tcMar>
+          </w:tcPr>
+          <w:p>
+            <w:r>
+              <w:t xml:space="preserve">Testers</w:t>
+            </w:r>
+          </w:p>
+        </w:tc>
+        <w:tc>
+          <w:tcPr>
+            <w:tcW w:type="dxa" w:w="7034"/>
+            <w:tcBorders>
+              <w:top w:val="single" w:color="BFBFBF" w:sz="4"/>
+              <w:left w:val="single" w:color="BFBFBF" w:sz="4"/>
+              <w:bottom w:val="single" w:color="BFBFBF" w:sz="4"/>
+              <w:right w:val="single" w:color="BFBFBF" w:sz="4"/>
+            </w:tcBorders>
+            <w:tcMar>
+              <w:top w:type="dxa" w:w="80"/>
+              <w:left w:type="dxa" w:w="120"/>
+              <w:bottom w:type="dxa" w:w="80"/>
+              <w:right w:type="dxa" w:w="120"/>
+            </w:tcMar>
+          </w:tcPr>
+          <w:p>
+            <w:r>
+              <w:t xml:space="preserve">Who retests which area, with each tester's case count and progress. Nobody retests their own stories from this sprint.</w:t>
             </w:r>
           </w:p>
         </w:tc>
       </w:tr>
       <w:tr>
-        <w:tc>
-          <w:tcPr>
-            <w:tcW w:type="dxa" w:w="2400"/>
-            <w:tcBorders>
-              <w:top w:val="single" w:color="BFBFBF" w:sz="4"/>
-              <w:left w:val="single" w:color="BFBFBF" w:sz="4"/>
-              <w:bottom w:val="single" w:color="BFBFBF" w:sz="4"/>
-              <w:right w:val="single" w:color="BFBFBF" w:sz="4"/>
-            </w:tcBorders>
-            <w:tcMar>
-              <w:top w:type="dxa" w:w="80"/>
-              <w:left w:type="dxa" w:w="120"/>
-              <w:bottom w:type="dxa" w:w="80"/>
-              <w:right w:type="dxa" w:w="120"/>
-            </w:tcMar>
-          </w:tcPr>
-          <w:p>
-            <w:r>
-              <w:t xml:space="preserve">Automated checks</w:t>
-            </w:r>
-          </w:p>
-        </w:tc>
-        <w:tc>
-          <w:tcPr>
-            <w:tcW w:type="dxa" w:w="6626"/>
-            <w:tcBorders>
-              <w:top w:val="single" w:color="BFBFBF" w:sz="4"/>
-              <w:left w:val="single" w:color="BFBFBF" w:sz="4"/>
-              <w:bottom w:val="single" w:color="BFBFBF" w:sz="4"/>
-              <w:right w:val="single" w:color="BFBFBF" w:sz="4"/>
-            </w:tcBorders>
-            <w:tcMar>
-              <w:top w:type="dxa" w:w="80"/>
-              <w:left w:type="dxa" w:w="120"/>
-              <w:bottom w:type="dxa" w:w="80"/>
-              <w:right w:type="dxa" w:w="120"/>
-            </w:tcMar>
-          </w:tcPr>
-          <w:p>
-            <w:r>
-              <w:t xml:space="preserve">The result of each command in step 1.</w:t>
+        <w:trPr>
+          <w:tblHeader w:val="off"/>
+        </w:trPr>
+        <w:tc>
+          <w:tcPr>
+            <w:tcW w:type="dxa" w:w="1992"/>
+            <w:tcBorders>
+              <w:top w:val="single" w:color="BFBFBF" w:sz="4"/>
+              <w:left w:val="single" w:color="BFBFBF" w:sz="4"/>
+              <w:bottom w:val="single" w:color="BFBFBF" w:sz="4"/>
+              <w:right w:val="single" w:color="BFBFBF" w:sz="4"/>
+            </w:tcBorders>
+            <w:tcMar>
+              <w:top w:type="dxa" w:w="80"/>
+              <w:left w:type="dxa" w:w="120"/>
+              <w:bottom w:type="dxa" w:w="80"/>
+              <w:right w:type="dxa" w:w="120"/>
+            </w:tcMar>
+          </w:tcPr>
+          <w:p>
+            <w:r>
+              <w:t xml:space="preserve">Retested cases</w:t>
+            </w:r>
+          </w:p>
+        </w:tc>
+        <w:tc>
+          <w:tcPr>
+            <w:tcW w:type="dxa" w:w="7034"/>
+            <w:tcBorders>
+              <w:top w:val="single" w:color="BFBFBF" w:sz="4"/>
+              <w:left w:val="single" w:color="BFBFBF" w:sz="4"/>
+              <w:bottom w:val="single" w:color="BFBFBF" w:sz="4"/>
+              <w:right w:val="single" w:color="BFBFBF" w:sz="4"/>
+            </w:tcBorders>
+            <w:tcMar>
+              <w:top w:type="dxa" w:w="80"/>
+              <w:left w:type="dxa" w:w="120"/>
+              <w:bottom w:type="dxa" w:w="80"/>
+              <w:right w:type="dxa" w:w="120"/>
+            </w:tcMar>
+          </w:tcPr>
+          <w:p>
+            <w:r>
+              <w:t xml:space="preserve">One row per selected case: who it is assigned to, the result, who tested it, the date and notes.</w:t>
             </w:r>
           </w:p>
         </w:tc>
       </w:tr>
       <w:tr>
-        <w:tc>
-          <w:tcPr>
-            <w:tcW w:type="dxa" w:w="2400"/>
-            <w:tcBorders>
-              <w:top w:val="single" w:color="BFBFBF" w:sz="4"/>
-              <w:left w:val="single" w:color="BFBFBF" w:sz="4"/>
-              <w:bottom w:val="single" w:color="BFBFBF" w:sz="4"/>
-              <w:right w:val="single" w:color="BFBFBF" w:sz="4"/>
-            </w:tcBorders>
-            <w:tcMar>
-              <w:top w:type="dxa" w:w="80"/>
-              <w:left w:type="dxa" w:w="120"/>
-              <w:bottom w:type="dxa" w:w="80"/>
-              <w:right w:type="dxa" w:w="120"/>
-            </w:tcMar>
-          </w:tcPr>
-          <w:p>
-            <w:r>
-              <w:t xml:space="preserve">Scope</w:t>
-            </w:r>
-          </w:p>
-        </w:tc>
-        <w:tc>
-          <w:tcPr>
-            <w:tcW w:type="dxa" w:w="6626"/>
-            <w:tcBorders>
-              <w:top w:val="single" w:color="BFBFBF" w:sz="4"/>
-              <w:left w:val="single" w:color="BFBFBF" w:sz="4"/>
-              <w:bottom w:val="single" w:color="BFBFBF" w:sz="4"/>
-              <w:right w:val="single" w:color="BFBFBF" w:sz="4"/>
-            </w:tcBorders>
-            <w:tcMar>
-              <w:top w:type="dxa" w:w="80"/>
-              <w:left w:type="dxa" w:w="120"/>
-              <w:bottom w:type="dxa" w:w="80"/>
-              <w:right w:type="dxa" w:w="120"/>
-            </w:tcMar>
-          </w:tcPr>
-          <w:p>
-            <w:r>
-              <w:t xml:space="preserve">Every earlier story, whether it is in scope, and why.</w:t>
+        <w:trPr>
+          <w:tblHeader w:val="off"/>
+        </w:trPr>
+        <w:tc>
+          <w:tcPr>
+            <w:tcW w:type="dxa" w:w="1992"/>
+            <w:tcBorders>
+              <w:top w:val="single" w:color="BFBFBF" w:sz="4"/>
+              <w:left w:val="single" w:color="BFBFBF" w:sz="4"/>
+              <w:bottom w:val="single" w:color="BFBFBF" w:sz="4"/>
+              <w:right w:val="single" w:color="BFBFBF" w:sz="4"/>
+            </w:tcBorders>
+            <w:tcMar>
+              <w:top w:type="dxa" w:w="80"/>
+              <w:left w:type="dxa" w:w="120"/>
+              <w:bottom w:type="dxa" w:w="80"/>
+              <w:right w:type="dxa" w:w="120"/>
+            </w:tcMar>
+          </w:tcPr>
+          <w:p>
+            <w:r>
+              <w:t xml:space="preserve">Rewritten cases</w:t>
+            </w:r>
+          </w:p>
+        </w:tc>
+        <w:tc>
+          <w:tcPr>
+            <w:tcW w:type="dxa" w:w="7034"/>
+            <w:tcBorders>
+              <w:top w:val="single" w:color="BFBFBF" w:sz="4"/>
+              <w:left w:val="single" w:color="BFBFBF" w:sz="4"/>
+              <w:bottom w:val="single" w:color="BFBFBF" w:sz="4"/>
+              <w:right w:val="single" w:color="BFBFBF" w:sz="4"/>
+            </w:tcBorders>
+            <w:tcMar>
+              <w:top w:type="dxa" w:w="80"/>
+              <w:left w:type="dxa" w:w="120"/>
+              <w:bottom w:type="dxa" w:w="80"/>
+              <w:right w:type="dxa" w:w="120"/>
+            </w:tcMar>
+          </w:tcPr>
+          <w:p>
+            <w:r>
+              <w:t xml:space="preserve">Steps and expected results for selected cases whose story workbook is out of date. Their IDs end in </w:t>
+            </w:r>
+            <w:r>
+              <w:rPr>
+                <w:rFonts w:ascii="Consolas" w:cs="Consolas" w:eastAsia="Consolas" w:hAnsi="Consolas"/>
+                <w:sz w:val="20"/>
+                <w:szCs w:val="20"/>
+              </w:rPr>
+              <w:t xml:space="preserve">-R</w:t>
+            </w:r>
+            <w:r>
+              <w:t xml:space="preserve">.</w:t>
             </w:r>
           </w:p>
         </w:tc>
       </w:tr>
       <w:tr>
-        <w:tc>
-          <w:tcPr>
-            <w:tcW w:type="dxa" w:w="2400"/>
-            <w:tcBorders>
-              <w:top w:val="single" w:color="BFBFBF" w:sz="4"/>
-              <w:left w:val="single" w:color="BFBFBF" w:sz="4"/>
-              <w:bottom w:val="single" w:color="BFBFBF" w:sz="4"/>
-              <w:right w:val="single" w:color="BFBFBF" w:sz="4"/>
-            </w:tcBorders>
-            <w:tcMar>
-              <w:top w:type="dxa" w:w="80"/>
-              <w:left w:type="dxa" w:w="120"/>
-              <w:bottom w:type="dxa" w:w="80"/>
-              <w:right w:type="dxa" w:w="120"/>
-            </w:tcMar>
-          </w:tcPr>
-          <w:p>
-            <w:r>
-              <w:t xml:space="preserve">Smoke run</w:t>
-            </w:r>
-          </w:p>
-        </w:tc>
-        <w:tc>
-          <w:tcPr>
-            <w:tcW w:type="dxa" w:w="6626"/>
-            <w:tcBorders>
-              <w:top w:val="single" w:color="BFBFBF" w:sz="4"/>
-              <w:left w:val="single" w:color="BFBFBF" w:sz="4"/>
-              <w:bottom w:val="single" w:color="BFBFBF" w:sz="4"/>
-              <w:right w:val="single" w:color="BFBFBF" w:sz="4"/>
-            </w:tcBorders>
-            <w:tcMar>
-              <w:top w:type="dxa" w:w="80"/>
-              <w:left w:type="dxa" w:w="120"/>
-              <w:bottom w:type="dxa" w:w="80"/>
-              <w:right w:type="dxa" w:w="120"/>
-            </w:tcMar>
-          </w:tcPr>
-          <w:p>
-            <w:r>
-              <w:t xml:space="preserve">The result of each step of the smoke run.</w:t>
+        <w:trPr>
+          <w:tblHeader w:val="off"/>
+        </w:trPr>
+        <w:tc>
+          <w:tcPr>
+            <w:tcW w:type="dxa" w:w="1992"/>
+            <w:tcBorders>
+              <w:top w:val="single" w:color="BFBFBF" w:sz="4"/>
+              <w:left w:val="single" w:color="BFBFBF" w:sz="4"/>
+              <w:bottom w:val="single" w:color="BFBFBF" w:sz="4"/>
+              <w:right w:val="single" w:color="BFBFBF" w:sz="4"/>
+            </w:tcBorders>
+            <w:tcMar>
+              <w:top w:type="dxa" w:w="80"/>
+              <w:left w:type="dxa" w:w="120"/>
+              <w:bottom w:type="dxa" w:w="80"/>
+              <w:right w:type="dxa" w:w="120"/>
+            </w:tcMar>
+          </w:tcPr>
+          <w:p>
+            <w:r>
+              <w:t xml:space="preserve">Out-of-date cases</w:t>
+            </w:r>
+          </w:p>
+        </w:tc>
+        <w:tc>
+          <w:tcPr>
+            <w:tcW w:type="dxa" w:w="7034"/>
+            <w:tcBorders>
+              <w:top w:val="single" w:color="BFBFBF" w:sz="4"/>
+              <w:left w:val="single" w:color="BFBFBF" w:sz="4"/>
+              <w:bottom w:val="single" w:color="BFBFBF" w:sz="4"/>
+              <w:right w:val="single" w:color="BFBFBF" w:sz="4"/>
+            </w:tcBorders>
+            <w:tcMar>
+              <w:top w:type="dxa" w:w="80"/>
+              <w:left w:type="dxa" w:w="120"/>
+              <w:bottom w:type="dxa" w:w="80"/>
+              <w:right w:type="dxa" w:w="120"/>
+            </w:tcMar>
+          </w:tcPr>
+          <w:p>
+            <w:r>
+              <w:t xml:space="preserve">Every story test case that a later story has made out of date, which story changed it, and whether it has been updated.</w:t>
             </w:r>
           </w:p>
         </w:tc>
       </w:tr>
       <w:tr>
-        <w:tc>
-          <w:tcPr>
-            <w:tcW w:type="dxa" w:w="2400"/>
+        <w:trPr>
+          <w:tblHeader w:val="off"/>
+        </w:trPr>
+        <w:tc>
+          <w:tcPr>
+            <w:tcW w:type="dxa" w:w="1992"/>
+            <w:tcBorders>
+              <w:top w:val="single" w:color="BFBFBF" w:sz="4"/>
+              <w:left w:val="single" w:color="BFBFBF" w:sz="4"/>
+              <w:bottom w:val="single" w:color="BFBFBF" w:sz="4"/>
+              <w:right w:val="single" w:color="BFBFBF" w:sz="4"/>
+            </w:tcBorders>
+            <w:tcMar>
+              <w:top w:type="dxa" w:w="80"/>
+              <w:left w:type="dxa" w:w="120"/>
+              <w:bottom w:type="dxa" w:w="80"/>
+              <w:right w:type="dxa" w:w="120"/>
+            </w:tcMar>
+          </w:tcPr>
+          <w:p>
+            <w:r>
+              <w:t xml:space="preserve">Automated checks</w:t>
+            </w:r>
+          </w:p>
+        </w:tc>
+        <w:tc>
+          <w:tcPr>
+            <w:tcW w:type="dxa" w:w="7034"/>
+            <w:tcBorders>
+              <w:top w:val="single" w:color="BFBFBF" w:sz="4"/>
+              <w:left w:val="single" w:color="BFBFBF" w:sz="4"/>
+              <w:bottom w:val="single" w:color="BFBFBF" w:sz="4"/>
+              <w:right w:val="single" w:color="BFBFBF" w:sz="4"/>
+            </w:tcBorders>
+            <w:tcMar>
+              <w:top w:type="dxa" w:w="80"/>
+              <w:left w:type="dxa" w:w="120"/>
+              <w:bottom w:type="dxa" w:w="80"/>
+              <w:right w:type="dxa" w:w="120"/>
+            </w:tcMar>
+          </w:tcPr>
+          <w:p>
+            <w:r>
+              <w:t xml:space="preserve">The result of each command in step 1.</w:t>
+            </w:r>
+          </w:p>
+        </w:tc>
+      </w:tr>
+      <w:tr>
+        <w:trPr>
+          <w:tblHeader w:val="off"/>
+        </w:trPr>
+        <w:tc>
+          <w:tcPr>
+            <w:tcW w:type="dxa" w:w="1992"/>
+            <w:tcBorders>
+              <w:top w:val="single" w:color="BFBFBF" w:sz="4"/>
+              <w:left w:val="single" w:color="BFBFBF" w:sz="4"/>
+              <w:bottom w:val="single" w:color="BFBFBF" w:sz="4"/>
+              <w:right w:val="single" w:color="BFBFBF" w:sz="4"/>
+            </w:tcBorders>
+            <w:tcMar>
+              <w:top w:type="dxa" w:w="80"/>
+              <w:left w:type="dxa" w:w="120"/>
+              <w:bottom w:type="dxa" w:w="80"/>
+              <w:right w:type="dxa" w:w="120"/>
+            </w:tcMar>
+          </w:tcPr>
+          <w:p>
+            <w:r>
+              <w:t xml:space="preserve">Scope</w:t>
+            </w:r>
+          </w:p>
+        </w:tc>
+        <w:tc>
+          <w:tcPr>
+            <w:tcW w:type="dxa" w:w="7034"/>
+            <w:tcBorders>
+              <w:top w:val="single" w:color="BFBFBF" w:sz="4"/>
+              <w:left w:val="single" w:color="BFBFBF" w:sz="4"/>
+              <w:bottom w:val="single" w:color="BFBFBF" w:sz="4"/>
+              <w:right w:val="single" w:color="BFBFBF" w:sz="4"/>
+            </w:tcBorders>
+            <w:tcMar>
+              <w:top w:type="dxa" w:w="80"/>
+              <w:left w:type="dxa" w:w="120"/>
+              <w:bottom w:type="dxa" w:w="80"/>
+              <w:right w:type="dxa" w:w="120"/>
+            </w:tcMar>
+          </w:tcPr>
+          <w:p>
+            <w:r>
+              <w:t xml:space="preserve">Every earlier story, whether it is in scope, and why.</w:t>
+            </w:r>
+          </w:p>
+        </w:tc>
+      </w:tr>
+      <w:tr>
+        <w:trPr>
+          <w:tblHeader w:val="off"/>
+        </w:trPr>
+        <w:tc>
+          <w:tcPr>
+            <w:tcW w:type="dxa" w:w="1992"/>
+            <w:tcBorders>
+              <w:top w:val="single" w:color="BFBFBF" w:sz="4"/>
+              <w:left w:val="single" w:color="BFBFBF" w:sz="4"/>
+              <w:bottom w:val="single" w:color="BFBFBF" w:sz="4"/>
+              <w:right w:val="single" w:color="BFBFBF" w:sz="4"/>
+            </w:tcBorders>
+            <w:tcMar>
+              <w:top w:type="dxa" w:w="80"/>
+              <w:left w:type="dxa" w:w="120"/>
+              <w:bottom w:type="dxa" w:w="80"/>
+              <w:right w:type="dxa" w:w="120"/>
+            </w:tcMar>
+          </w:tcPr>
+          <w:p>
+            <w:r>
+              <w:t xml:space="preserve">Smoke run</w:t>
+            </w:r>
+          </w:p>
+        </w:tc>
+        <w:tc>
+          <w:tcPr>
+            <w:tcW w:type="dxa" w:w="7034"/>
+            <w:tcBorders>
+              <w:top w:val="single" w:color="BFBFBF" w:sz="4"/>
+              <w:left w:val="single" w:color="BFBFBF" w:sz="4"/>
+              <w:bottom w:val="single" w:color="BFBFBF" w:sz="4"/>
+              <w:right w:val="single" w:color="BFBFBF" w:sz="4"/>
+            </w:tcBorders>
+            <w:tcMar>
+              <w:top w:type="dxa" w:w="80"/>
+              <w:left w:type="dxa" w:w="120"/>
+              <w:bottom w:type="dxa" w:w="80"/>
+              <w:right w:type="dxa" w:w="120"/>
+            </w:tcMar>
+          </w:tcPr>
+          <w:p>
+            <w:r>
+              <w:t xml:space="preserve">The result of each step of the smoke run.</w:t>
+            </w:r>
+          </w:p>
+        </w:tc>
+      </w:tr>
+      <w:tr>
+        <w:trPr>
+          <w:tblHeader w:val="off"/>
+        </w:trPr>
+        <w:tc>
+          <w:tcPr>
+            <w:tcW w:type="dxa" w:w="1992"/>
             <w:tcBorders>
               <w:top w:val="single" w:color="BFBFBF" w:sz="4"/>
               <w:left w:val="single" w:color="BFBFBF" w:sz="4"/>
@@ -1250,7 +1652,7 @@
         </w:tc>
         <w:tc>
           <w:tcPr>
-            <w:tcW w:type="dxa" w:w="6626"/>
+            <w:tcW w:type="dxa" w:w="7034"/>
             <w:tcBorders>
               <w:top w:val="single" w:color="BFBFBF" w:sz="4"/>
               <w:left w:val="single" w:color="BFBFBF" w:sz="4"/>
@@ -1274,7 +1676,7 @@
     </w:tbl>
     <w:p>
       <w:pPr>
-        <w:spacing w:after="140"/>
+        <w:spacing w:after="80"/>
       </w:pPr>
     </w:p>
     <w:p>
@@ -1317,9 +1719,9 @@
         </w:tblBorders>
       </w:tblPr>
       <w:tblGrid>
-        <w:gridCol w:w="1900"/>
-        <w:gridCol w:w="3826"/>
-        <w:gridCol w:w="3300"/>
+        <w:gridCol w:w="1120"/>
+        <w:gridCol w:w="3952"/>
+        <w:gridCol w:w="3954"/>
       </w:tblGrid>
       <w:tr>
         <w:trPr>
@@ -1327,14 +1729,14 @@
         </w:trPr>
         <w:tc>
           <w:tcPr>
-            <w:tcW w:type="dxa" w:w="1900"/>
-            <w:tcBorders>
-              <w:top w:val="single" w:color="BFBFBF" w:sz="4"/>
-              <w:left w:val="single" w:color="BFBFBF" w:sz="4"/>
-              <w:bottom w:val="single" w:color="BFBFBF" w:sz="4"/>
-              <w:right w:val="single" w:color="BFBFBF" w:sz="4"/>
-            </w:tcBorders>
-            <w:shd w:fill="E7EEF7" w:val="clear"/>
+            <w:tcW w:type="dxa" w:w="1120"/>
+            <w:tcBorders>
+              <w:top w:val="single" w:color="BFBFBF" w:sz="4"/>
+              <w:left w:val="single" w:color="BFBFBF" w:sz="4"/>
+              <w:bottom w:val="single" w:color="BFBFBF" w:sz="4"/>
+              <w:right w:val="single" w:color="BFBFBF" w:sz="4"/>
+            </w:tcBorders>
+            <w:shd w:fill="E7EEF7" w:color="auto" w:val="clear"/>
             <w:tcMar>
               <w:top w:type="dxa" w:w="80"/>
               <w:left w:type="dxa" w:w="120"/>
@@ -1354,14 +1756,14 @@
         </w:tc>
         <w:tc>
           <w:tcPr>
-            <w:tcW w:type="dxa" w:w="3826"/>
-            <w:tcBorders>
-              <w:top w:val="single" w:color="BFBFBF" w:sz="4"/>
-              <w:left w:val="single" w:color="BFBFBF" w:sz="4"/>
-              <w:bottom w:val="single" w:color="BFBFBF" w:sz="4"/>
-              <w:right w:val="single" w:color="BFBFBF" w:sz="4"/>
-            </w:tcBorders>
-            <w:shd w:fill="E7EEF7" w:val="clear"/>
+            <w:tcW w:type="dxa" w:w="3952"/>
+            <w:tcBorders>
+              <w:top w:val="single" w:color="BFBFBF" w:sz="4"/>
+              <w:left w:val="single" w:color="BFBFBF" w:sz="4"/>
+              <w:bottom w:val="single" w:color="BFBFBF" w:sz="4"/>
+              <w:right w:val="single" w:color="BFBFBF" w:sz="4"/>
+            </w:tcBorders>
+            <w:shd w:fill="E7EEF7" w:color="auto" w:val="clear"/>
             <w:tcMar>
               <w:top w:type="dxa" w:w="80"/>
               <w:left w:type="dxa" w:w="120"/>
@@ -1381,14 +1783,14 @@
         </w:tc>
         <w:tc>
           <w:tcPr>
-            <w:tcW w:type="dxa" w:w="3300"/>
-            <w:tcBorders>
-              <w:top w:val="single" w:color="BFBFBF" w:sz="4"/>
-              <w:left w:val="single" w:color="BFBFBF" w:sz="4"/>
-              <w:bottom w:val="single" w:color="BFBFBF" w:sz="4"/>
-              <w:right w:val="single" w:color="BFBFBF" w:sz="4"/>
-            </w:tcBorders>
-            <w:shd w:fill="E7EEF7" w:val="clear"/>
+            <w:tcW w:type="dxa" w:w="3954"/>
+            <w:tcBorders>
+              <w:top w:val="single" w:color="BFBFBF" w:sz="4"/>
+              <w:left w:val="single" w:color="BFBFBF" w:sz="4"/>
+              <w:bottom w:val="single" w:color="BFBFBF" w:sz="4"/>
+              <w:right w:val="single" w:color="BFBFBF" w:sz="4"/>
+            </w:tcBorders>
+            <w:shd w:fill="E7EEF7" w:color="auto" w:val="clear"/>
             <w:tcMar>
               <w:top w:type="dxa" w:w="80"/>
               <w:left w:type="dxa" w:w="120"/>
@@ -1408,9 +1810,12 @@
         </w:tc>
       </w:tr>
       <w:tr>
-        <w:tc>
-          <w:tcPr>
-            <w:tcW w:type="dxa" w:w="1900"/>
+        <w:trPr>
+          <w:tblHeader w:val="off"/>
+        </w:trPr>
+        <w:tc>
+          <w:tcPr>
+            <w:tcW w:type="dxa" w:w="1120"/>
             <w:tcBorders>
               <w:top w:val="single" w:color="BFBFBF" w:sz="4"/>
               <w:left w:val="single" w:color="BFBFBF" w:sz="4"/>
@@ -1432,7 +1837,7 @@
         </w:tc>
         <w:tc>
           <w:tcPr>
-            <w:tcW w:type="dxa" w:w="3826"/>
+            <w:tcW w:type="dxa" w:w="3952"/>
             <w:tcBorders>
               <w:top w:val="single" w:color="BFBFBF" w:sz="4"/>
               <w:left w:val="single" w:color="BFBFBF" w:sz="4"/>
@@ -1454,7 +1859,7 @@
         </w:tc>
         <w:tc>
           <w:tcPr>
-            <w:tcW w:type="dxa" w:w="3300"/>
+            <w:tcW w:type="dxa" w:w="3954"/>
             <w:tcBorders>
               <w:top w:val="single" w:color="BFBFBF" w:sz="4"/>
               <w:left w:val="single" w:color="BFBFBF" w:sz="4"/>
@@ -1476,9 +1881,12 @@
         </w:tc>
       </w:tr>
       <w:tr>
-        <w:tc>
-          <w:tcPr>
-            <w:tcW w:type="dxa" w:w="1900"/>
+        <w:trPr>
+          <w:tblHeader w:val="off"/>
+        </w:trPr>
+        <w:tc>
+          <w:tcPr>
+            <w:tcW w:type="dxa" w:w="1120"/>
             <w:tcBorders>
               <w:top w:val="single" w:color="BFBFBF" w:sz="4"/>
               <w:left w:val="single" w:color="BFBFBF" w:sz="4"/>
@@ -1500,7 +1908,7 @@
         </w:tc>
         <w:tc>
           <w:tcPr>
-            <w:tcW w:type="dxa" w:w="3826"/>
+            <w:tcW w:type="dxa" w:w="3952"/>
             <w:tcBorders>
               <w:top w:val="single" w:color="BFBFBF" w:sz="4"/>
               <w:left w:val="single" w:color="BFBFBF" w:sz="4"/>
@@ -1522,7 +1930,7 @@
         </w:tc>
         <w:tc>
           <w:tcPr>
-            <w:tcW w:type="dxa" w:w="3300"/>
+            <w:tcW w:type="dxa" w:w="3954"/>
             <w:tcBorders>
               <w:top w:val="single" w:color="BFBFBF" w:sz="4"/>
               <w:left w:val="single" w:color="BFBFBF" w:sz="4"/>
@@ -1544,9 +1952,12 @@
         </w:tc>
       </w:tr>
       <w:tr>
-        <w:tc>
-          <w:tcPr>
-            <w:tcW w:type="dxa" w:w="1900"/>
+        <w:trPr>
+          <w:tblHeader w:val="off"/>
+        </w:trPr>
+        <w:tc>
+          <w:tcPr>
+            <w:tcW w:type="dxa" w:w="1120"/>
             <w:tcBorders>
               <w:top w:val="single" w:color="BFBFBF" w:sz="4"/>
               <w:left w:val="single" w:color="BFBFBF" w:sz="4"/>
@@ -1568,7 +1979,7 @@
         </w:tc>
         <w:tc>
           <w:tcPr>
-            <w:tcW w:type="dxa" w:w="3826"/>
+            <w:tcW w:type="dxa" w:w="3952"/>
             <w:tcBorders>
               <w:top w:val="single" w:color="BFBFBF" w:sz="4"/>
               <w:left w:val="single" w:color="BFBFBF" w:sz="4"/>
@@ -1590,7 +2001,7 @@
         </w:tc>
         <w:tc>
           <w:tcPr>
-            <w:tcW w:type="dxa" w:w="3300"/>
+            <w:tcW w:type="dxa" w:w="3954"/>
             <w:tcBorders>
               <w:top w:val="single" w:color="BFBFBF" w:sz="4"/>
               <w:left w:val="single" w:color="BFBFBF" w:sz="4"/>
@@ -1612,9 +2023,12 @@
         </w:tc>
       </w:tr>
       <w:tr>
-        <w:tc>
-          <w:tcPr>
-            <w:tcW w:type="dxa" w:w="1900"/>
+        <w:trPr>
+          <w:tblHeader w:val="off"/>
+        </w:trPr>
+        <w:tc>
+          <w:tcPr>
+            <w:tcW w:type="dxa" w:w="1120"/>
             <w:tcBorders>
               <w:top w:val="single" w:color="BFBFBF" w:sz="4"/>
               <w:left w:val="single" w:color="BFBFBF" w:sz="4"/>
@@ -1636,7 +2050,7 @@
         </w:tc>
         <w:tc>
           <w:tcPr>
-            <w:tcW w:type="dxa" w:w="3826"/>
+            <w:tcW w:type="dxa" w:w="3952"/>
             <w:tcBorders>
               <w:top w:val="single" w:color="BFBFBF" w:sz="4"/>
               <w:left w:val="single" w:color="BFBFBF" w:sz="4"/>
@@ -1658,7 +2072,7 @@
         </w:tc>
         <w:tc>
           <w:tcPr>
-            <w:tcW w:type="dxa" w:w="3300"/>
+            <w:tcW w:type="dxa" w:w="3954"/>
             <w:tcBorders>
               <w:top w:val="single" w:color="BFBFBF" w:sz="4"/>
               <w:left w:val="single" w:color="BFBFBF" w:sz="4"/>
@@ -1682,7 +2096,7 @@
     </w:tbl>
     <w:p>
       <w:pPr>
-        <w:spacing w:after="140"/>
+        <w:spacing w:after="80"/>
       </w:pPr>
     </w:p>
     <w:p>
@@ -1817,7 +2231,7 @@
     </w:p>
     <w:p>
       <w:pPr>
-        <w:shd w:fill="F2F2F2" w:val="clear"/>
+        <w:shd w:fill="F2F2F2" w:color="auto" w:val="clear"/>
         <w:spacing w:after="0" w:before="80"/>
         <w:ind w:left="200" w:right="200"/>
       </w:pPr>
@@ -1832,8 +2246,8 @@
     </w:p>
     <w:p>
       <w:pPr>
-        <w:shd w:fill="F2F2F2" w:val="clear"/>
-        <w:spacing w:after="200" w:before="0"/>
+        <w:shd w:fill="F2F2F2" w:color="auto" w:val="clear"/>
+        <w:spacing w:after="160" w:before="0"/>
         <w:ind w:left="200" w:right="200"/>
       </w:pPr>
       <w:r>
@@ -2062,42 +2476,6 @@
       </w:pPr>
     </w:lvl>
   </w:abstractNum>
-  <w:abstractNum w:abstractNumId="4" w15:restartNumberingAfterBreak="0">
-    <w:multiLevelType w:val="hybridMultilevel"/>
-    <w:lvl w:ilvl="0" w:tentative="1">
-      <w:start w:val="1"/>
-      <w:numFmt w:val="decimal"/>
-      <w:lvlText w:val="%1."/>
-      <w:lvlJc w:val="left"/>
-      <w:pPr>
-        <w:ind w:left="720" w:hanging="360"/>
-      </w:pPr>
-    </w:lvl>
-  </w:abstractNum>
-  <w:abstractNum w:abstractNumId="5" w15:restartNumberingAfterBreak="0">
-    <w:multiLevelType w:val="hybridMultilevel"/>
-    <w:lvl w:ilvl="0" w:tentative="1">
-      <w:start w:val="1"/>
-      <w:numFmt w:val="decimal"/>
-      <w:lvlText w:val="%1."/>
-      <w:lvlJc w:val="left"/>
-      <w:pPr>
-        <w:ind w:left="720" w:hanging="360"/>
-      </w:pPr>
-    </w:lvl>
-  </w:abstractNum>
-  <w:abstractNum w:abstractNumId="6" w15:restartNumberingAfterBreak="0">
-    <w:multiLevelType w:val="hybridMultilevel"/>
-    <w:lvl w:ilvl="0" w:tentative="1">
-      <w:start w:val="1"/>
-      <w:numFmt w:val="decimal"/>
-      <w:lvlText w:val="%1."/>
-      <w:lvlJc w:val="left"/>
-      <w:pPr>
-        <w:ind w:left="720" w:hanging="360"/>
-      </w:pPr>
-    </w:lvl>
-  </w:abstractNum>
   <w:num w:numId="1">
     <w:abstractNumId w:val="1"/>
     <w:lvlOverride w:ilvl="0">
@@ -2117,19 +2495,19 @@
     </w:lvlOverride>
   </w:num>
   <w:num w:numId="4">
-    <w:abstractNumId w:val="4"/>
+    <w:abstractNumId w:val="3"/>
     <w:lvlOverride w:ilvl="0">
       <w:startOverride w:val="1"/>
     </w:lvlOverride>
   </w:num>
   <w:num w:numId="5">
-    <w:abstractNumId w:val="5"/>
+    <w:abstractNumId w:val="3"/>
     <w:lvlOverride w:ilvl="0">
       <w:startOverride w:val="1"/>
     </w:lvlOverride>
   </w:num>
   <w:num w:numId="6">
-    <w:abstractNumId w:val="6"/>
+    <w:abstractNumId w:val="3"/>
     <w:lvlOverride w:ilvl="0">
       <w:startOverride w:val="1"/>
     </w:lvlOverride>
@@ -2202,11 +2580,6 @@
       <w:b/>
       <w:bCs/>
     </w:rPr>
-  </w:style>
-  <w:style w:type="paragraph" w:styleId="ListParagraph">
-    <w:name w:val="List Paragraph"/>
-    <w:basedOn w:val="Normal"/>
-    <w:qFormat/>
   </w:style>
   <w:style w:type="character" w:styleId="Hyperlink">
     <w:name w:val="Hyperlink"/>
@@ -2346,6 +2719,11 @@
       <w:sz w:val="25"/>
       <w:szCs w:val="25"/>
     </w:rPr>
+  </w:style>
+  <w:style w:type="paragraph" w:styleId="ListParagraph">
+    <w:name w:val="List Paragraph"/>
+    <w:basedOn w:val="Normal"/>
+    <w:qFormat/>
   </w:style>
 </w:styles>
 </file>

</xml_diff>

<commit_message>
Rebuild Sprint 3 regression suite per tester after SPM-52 and SPM-65
SPM-52 and SPM-65 have merged, so the scope is redone against main at
135213b: SPM-52 is in scope (SPM-65 changed its files after it merged)
and SPM-65, the last merge, is covered by its own test pass and the
smoke run. 169 cases.

Each tester now has their own sheet with every case's preconditions,
test data, steps and expected results, so nobody needs the story
workbooks during the run. The 30 rewritten cases sit on those sheets
and were rerun on a copy of the database against today's main; one
picks up SPM-65's new Attendees tab. Automated checks move onto the
Summary as CI plus the two verify scripts, and the Testers, Retested
cases, Rewritten cases, Automated checks and Follow-ups sheets are
gone. Run-order notes now point the right way.

The guide and its Word copy describe the new layout.

Co-Authored-By: Claude Opus 5.5 <noreply@anthropic.com>
</commit_message>
<xml_diff>
--- a/docs/Regression_Testing_Guide.docx
+++ b/docs/Regression_Testing_Guide.docx
@@ -34,7 +34,7 @@
         <w:spacing w:after="140"/>
       </w:pPr>
       <w:r>
-        <w:t xml:space="preserve">It should take one or two people about half a day. If it is taking longer, the scope in step 2 is too wide.</w:t>
+        <w:t xml:space="preserve">Split the cases between the team by feature area, so each person's share takes an afternoon. If it is taking longer, the scope in step 2 is too wide.</w:t>
       </w:r>
     </w:p>
     <w:p>
@@ -93,7 +93,7 @@
         <w:t xml:space="preserve">docs/test-cases/</w:t>
       </w:r>
       <w:r>
-        <w:t xml:space="preserve"> hold each story's original test run and stay as they are. Open them to read the steps; write the results in the sprint's regression log (step 6).</w:t>
+        <w:t xml:space="preserve"> hold each story's original test run and stay as they are. The sprint's regression log (step 6) copies in the steps of every selected case, so testers work from the log alone.</w:t>
       </w:r>
     </w:p>
     <w:p>
@@ -146,7 +146,7 @@
         <w:spacing w:after="140"/>
       </w:pPr>
       <w:r>
-        <w:t xml:space="preserve">On an up-to-date </w:t>
+        <w:t xml:space="preserve">CI runs lint, type-check, unit tests, the test case check, the build, migrations, the fixture scripts and the end-to-end tests on every merge to </w:t>
       </w:r>
       <w:r>
         <w:rPr>
@@ -157,7 +157,37 @@
         <w:t xml:space="preserve">main</w:t>
       </w:r>
       <w:r>
-        <w:t xml:space="preserve">:</w:t>
+        <w:t xml:space="preserve">. Check on GitHub that CI is green for the commit you are testing.</w:t>
+      </w:r>
+    </w:p>
+    <w:p>
+      <w:pPr>
+        <w:spacing w:after="140"/>
+      </w:pPr>
+      <w:r>
+        <w:t xml:space="preserve">CI does not run the two checks that need the shared database. Run them on an up-to-date </w:t>
+      </w:r>
+      <w:r>
+        <w:rPr>
+          <w:rFonts w:ascii="Consolas" w:cs="Consolas" w:eastAsia="Consolas" w:hAnsi="Consolas"/>
+          <w:sz w:val="20"/>
+          <w:szCs w:val="20"/>
+        </w:rPr>
+        <w:t xml:space="preserve">main</w:t>
+      </w:r>
+      <w:r>
+        <w:t xml:space="preserve">, with </w:t>
+      </w:r>
+      <w:r>
+        <w:rPr>
+          <w:rFonts w:ascii="Consolas" w:cs="Consolas" w:eastAsia="Consolas" w:hAnsi="Consolas"/>
+          <w:sz w:val="20"/>
+          <w:szCs w:val="20"/>
+        </w:rPr>
+        <w:t xml:space="preserve">npm run dev</w:t>
+      </w:r>
+      <w:r>
+        <w:t xml:space="preserve"> running in a second terminal:</w:t>
       </w:r>
     </w:p>
     <w:p>
@@ -217,37 +247,7 @@
           <w:sz w:val="18"/>
           <w:szCs w:val="18"/>
         </w:rPr>
-        <w:t xml:space="preserve">npm test</w:t>
-      </w:r>
-    </w:p>
-    <w:p>
-      <w:pPr>
-        <w:shd w:fill="F2F2F2" w:color="auto" w:val="clear"/>
-        <w:spacing w:after="0" w:before="0"/>
-        <w:ind w:left="200" w:right="200"/>
-      </w:pPr>
-      <w:r>
-        <w:rPr>
-          <w:rFonts w:ascii="Consolas" w:cs="Consolas" w:eastAsia="Consolas" w:hAnsi="Consolas"/>
-          <w:sz w:val="18"/>
-          <w:szCs w:val="18"/>
-        </w:rPr>
-        <w:t xml:space="preserve">npm run lint</w:t>
-      </w:r>
-    </w:p>
-    <w:p>
-      <w:pPr>
-        <w:shd w:fill="F2F2F2" w:color="auto" w:val="clear"/>
-        <w:spacing w:after="0" w:before="0"/>
-        <w:ind w:left="200" w:right="200"/>
-      </w:pPr>
-      <w:r>
-        <w:rPr>
-          <w:rFonts w:ascii="Consolas" w:cs="Consolas" w:eastAsia="Consolas" w:hAnsi="Consolas"/>
-          <w:sz w:val="18"/>
-          <w:szCs w:val="18"/>
-        </w:rPr>
-        <w:t xml:space="preserve">npm run build</w:t>
+        <w:t xml:space="preserve">npm run verify:permissions</w:t>
       </w:r>
     </w:p>
     <w:p>
@@ -262,7 +262,7 @@
           <w:sz w:val="18"/>
           <w:szCs w:val="18"/>
         </w:rPr>
-        <w:t xml:space="preserve">npm run test-cases:check</w:t>
+        <w:t xml:space="preserve">npm run verify:login</w:t>
       </w:r>
     </w:p>
     <w:p>
@@ -270,64 +270,17 @@
         <w:spacing w:after="140"/>
       </w:pPr>
       <w:r>
-        <w:t xml:space="preserve">Then, with </w:t>
-      </w:r>
-      <w:r>
-        <w:rPr>
-          <w:rFonts w:ascii="Consolas" w:cs="Consolas" w:eastAsia="Consolas" w:hAnsi="Consolas"/>
-          <w:sz w:val="20"/>
-          <w:szCs w:val="20"/>
-        </w:rPr>
-        <w:t xml:space="preserve">npm run dev</w:t>
-      </w:r>
-      <w:r>
-        <w:t xml:space="preserve"> running in a second terminal:</w:t>
-      </w:r>
-    </w:p>
-    <w:p>
-      <w:pPr>
-        <w:shd w:fill="F2F2F2" w:color="auto" w:val="clear"/>
-        <w:spacing w:after="0" w:before="80"/>
-        <w:ind w:left="200" w:right="200"/>
-      </w:pPr>
-      <w:r>
-        <w:rPr>
-          <w:rFonts w:ascii="Consolas" w:cs="Consolas" w:eastAsia="Consolas" w:hAnsi="Consolas"/>
-          <w:sz w:val="18"/>
-          <w:szCs w:val="18"/>
-        </w:rPr>
-        <w:t xml:space="preserve">npm run verify:permissions</w:t>
-      </w:r>
-    </w:p>
-    <w:p>
-      <w:pPr>
-        <w:shd w:fill="F2F2F2" w:color="auto" w:val="clear"/>
-        <w:spacing w:after="160" w:before="0"/>
-        <w:ind w:left="200" w:right="200"/>
-      </w:pPr>
-      <w:r>
-        <w:rPr>
-          <w:rFonts w:ascii="Consolas" w:cs="Consolas" w:eastAsia="Consolas" w:hAnsi="Consolas"/>
-          <w:sz w:val="18"/>
-          <w:szCs w:val="18"/>
-        </w:rPr>
-        <w:t xml:space="preserve">npm run verify:login</w:t>
-      </w:r>
-    </w:p>
-    <w:p>
-      <w:pPr>
-        <w:spacing w:after="140"/>
-      </w:pPr>
-      <w:r>
-        <w:t xml:space="preserve">Also check that CI is green on GitHub for the commit you are testing. CI runs the end-to-end smoke tests, which refuse to run against the shared database.</w:t>
-      </w:r>
-    </w:p>
-    <w:p>
-      <w:pPr>
-        <w:spacing w:after="140"/>
-      </w:pPr>
-      <w:r>
-        <w:t xml:space="preserve">All of them must pass before any manual testing. A failure here is a regression: handle it as in step 7, then start again from this step.</w:t>
+        <w:t xml:space="preserve">Record all three on the log's </w:t>
+      </w:r>
+      <w:r>
+        <w:rPr>
+          <w:b/>
+          <w:bCs/>
+        </w:rPr>
+        <w:t xml:space="preserve">Summary</w:t>
+      </w:r>
+      <w:r>
+        <w:t xml:space="preserve"> sheet. They must pass before any manual testing. A failure here is a regression: handle it as in step 7, then start again from this step.</w:t>
       </w:r>
     </w:p>
     <w:p>
@@ -663,38 +616,126 @@
         <w:spacing w:after="140"/>
       </w:pPr>
       <w:r>
-        <w:t xml:space="preserve">Before the run, check whether a story finished this sprint changed on purpose what a selected case expects. For example, a case that ticks booking slots that no longer exist, or one that expects a refusal message that now reads differently. Do not edit the story's test case files for this. Rewrite the case on the log's </w:t>
+        <w:t xml:space="preserve">Before the run, check whether a story finished this sprint changed on purpose what a selected case expects. For example, a case that ticks booking slots that no longer exist, or one that expects a refusal message that now reads differently. Do not edit the story's test case files for this. Rewrite the case in the log, give it the same ID with </w:t>
+      </w:r>
+      <w:r>
+        <w:rPr>
+          <w:rFonts w:ascii="Consolas" w:cs="Consolas" w:eastAsia="Consolas" w:hAnsi="Consolas"/>
+          <w:sz w:val="20"/>
+          <w:szCs w:val="20"/>
+        </w:rPr>
+        <w:t xml:space="preserve">-R</w:t>
+      </w:r>
+      <w:r>
+        <w:t xml:space="preserve"> on the end, and run it on a copy of the database before the regression run, so its expected results come from the screen. List every out-of-date case, selected or not, on the </w:t>
       </w:r>
       <w:r>
         <w:rPr>
           <w:b/>
           <w:bCs/>
         </w:rPr>
-        <w:t xml:space="preserve">Rewritten cases</w:t>
-      </w:r>
-      <w:r>
-        <w:t xml:space="preserve"> sheet, give it the same ID with </w:t>
-      </w:r>
-      <w:r>
-        <w:rPr>
-          <w:rFonts w:ascii="Consolas" w:cs="Consolas" w:eastAsia="Consolas" w:hAnsi="Consolas"/>
-          <w:sz w:val="20"/>
-          <w:szCs w:val="20"/>
-        </w:rPr>
-        <w:t xml:space="preserve">-R</w:t>
-      </w:r>
-      <w:r>
-        <w:t xml:space="preserve"> on the end, and run it on a copy of the database before the regression run, so its expected results come from the screen. List every out-of-date case, selected or not, on the </w:t>
-      </w:r>
+        <w:t xml:space="preserve">Out-of-date cases</w:t>
+      </w:r>
+      <w:r>
+        <w:t xml:space="preserve"> sheet with the story that changed it. The story's owner updates the test case files afterwards (step 6).</w:t>
+      </w:r>
+    </w:p>
+    <w:p>
+      <w:pPr>
+        <w:spacing w:after="140"/>
+      </w:pPr>
+      <w:r>
+        <w:t xml:space="preserve">Put the selected cases into the log before you start, so the scope is fixed before the results come in. Give each tester one feature area, and avoid giving anyone their own stories from this sprint.</w:t>
+      </w:r>
+    </w:p>
+    <w:p>
+      <w:pPr>
+        <w:pStyle w:val="Heading1"/>
+      </w:pPr>
+      <w:r>
+        <w:t xml:space="preserve">Step 4: Prepare the test data</w:t>
+      </w:r>
+    </w:p>
+    <w:p>
+      <w:pPr>
+        <w:pStyle w:val="ListParagraph"/>
+        <w:numPr>
+          <w:ilvl w:val="0"/>
+          <w:numId w:val="3"/>
+        </w:numPr>
+        <w:spacing w:after="80"/>
+      </w:pPr>
+      <w:r>
+        <w:t xml:space="preserve">If a story in scope has a fixture script (</w:t>
+      </w:r>
+      <w:r>
+        <w:rPr>
+          <w:rFonts w:ascii="Consolas" w:cs="Consolas" w:eastAsia="Consolas" w:hAnsi="Consolas"/>
+          <w:sz w:val="20"/>
+          <w:szCs w:val="20"/>
+        </w:rPr>
+        <w:t xml:space="preserve">npm run fixtures:spm&lt;NN&gt;</w:t>
+      </w:r>
+      <w:r>
+        <w:t xml:space="preserve">, listed in </w:t>
+      </w:r>
+      <w:r>
+        <w:rPr>
+          <w:rFonts w:ascii="Consolas" w:cs="Consolas" w:eastAsia="Consolas" w:hAnsi="Consolas"/>
+          <w:sz w:val="20"/>
+          <w:szCs w:val="20"/>
+        </w:rPr>
+        <w:t xml:space="preserve">package.json</w:t>
+      </w:r>
+      <w:r>
+        <w:t xml:space="preserve">), run it before testing that story, and again after any case that changes data. The case's preconditions say when.</w:t>
+      </w:r>
+    </w:p>
+    <w:p>
+      <w:pPr>
+        <w:pStyle w:val="ListParagraph"/>
+        <w:numPr>
+          <w:ilvl w:val="0"/>
+          <w:numId w:val="3"/>
+        </w:numPr>
+        <w:spacing w:after="80"/>
+      </w:pPr>
+      <w:r>
+        <w:t xml:space="preserve">Stories without a fixture script use the base seed data. If a precondition no longer matches what is in the database, record the case as </w:t>
+      </w:r>
+      <w:r>
+        <w:rPr>
+          <w:rFonts w:ascii="Consolas" w:cs="Consolas" w:eastAsia="Consolas" w:hAnsi="Consolas"/>
+          <w:sz w:val="20"/>
+          <w:szCs w:val="20"/>
+        </w:rPr>
+        <w:t xml:space="preserve">Blocked</w:t>
+      </w:r>
+      <w:r>
+        <w:t xml:space="preserve"> and move on. Do not reseed to fix it.</w:t>
+      </w:r>
+    </w:p>
+    <w:p>
+      <w:pPr>
+        <w:pStyle w:val="Heading1"/>
+      </w:pPr>
+      <w:r>
+        <w:t xml:space="preserve">Step 5: Run the selected cases and the smoke run</w:t>
+      </w:r>
+    </w:p>
+    <w:p>
+      <w:pPr>
+        <w:spacing w:after="140"/>
+      </w:pPr>
       <w:r>
         <w:rPr>
           <w:b/>
           <w:bCs/>
         </w:rPr>
-        <w:t xml:space="preserve">Out-of-date cases</w:t>
-      </w:r>
-      <w:r>
-        <w:t xml:space="preserve"> sheet with the story that changed it. The story's owner updates the test case files afterwards (step 6).</w:t>
+        <w:t xml:space="preserve">Selected cases.</w:t>
+      </w:r>
+      <w:r>
+        <w:t xml:space="preserve"> Work down your own sheet in the log from top to bottom. A blue row starts each story and names its fixture script. Each case row has the preconditions, test data, steps and expected results, so there is no need to open the story workbooks.</w:t>
       </w:r>
     </w:p>
     <w:p>
@@ -702,82 +743,7 @@
         <w:spacing w:after="140"/>
       </w:pPr>
       <w:r>
-        <w:t xml:space="preserve">Write the selected case IDs into the regression log before you start, so the scope is fixed before the results come in.</w:t>
-      </w:r>
-    </w:p>
-    <w:p>
-      <w:pPr>
-        <w:pStyle w:val="Heading1"/>
-      </w:pPr>
-      <w:r>
-        <w:t xml:space="preserve">Step 4: Prepare the test data</w:t>
-      </w:r>
-    </w:p>
-    <w:p>
-      <w:pPr>
-        <w:pStyle w:val="ListParagraph"/>
-        <w:numPr>
-          <w:ilvl w:val="0"/>
-          <w:numId w:val="3"/>
-        </w:numPr>
-        <w:spacing w:after="80"/>
-      </w:pPr>
-      <w:r>
-        <w:t xml:space="preserve">If a story in scope has a fixture script (</w:t>
-      </w:r>
-      <w:r>
-        <w:rPr>
-          <w:rFonts w:ascii="Consolas" w:cs="Consolas" w:eastAsia="Consolas" w:hAnsi="Consolas"/>
-          <w:sz w:val="20"/>
-          <w:szCs w:val="20"/>
-        </w:rPr>
-        <w:t xml:space="preserve">npm run fixtures:spm&lt;NN&gt;</w:t>
-      </w:r>
-      <w:r>
-        <w:t xml:space="preserve">, listed in </w:t>
-      </w:r>
-      <w:r>
-        <w:rPr>
-          <w:rFonts w:ascii="Consolas" w:cs="Consolas" w:eastAsia="Consolas" w:hAnsi="Consolas"/>
-          <w:sz w:val="20"/>
-          <w:szCs w:val="20"/>
-        </w:rPr>
-        <w:t xml:space="preserve">package.json</w:t>
-      </w:r>
-      <w:r>
-        <w:t xml:space="preserve">), run it before testing that story, and again after any case that changes data. The case's preconditions say when.</w:t>
-      </w:r>
-    </w:p>
-    <w:p>
-      <w:pPr>
-        <w:pStyle w:val="ListParagraph"/>
-        <w:numPr>
-          <w:ilvl w:val="0"/>
-          <w:numId w:val="3"/>
-        </w:numPr>
-        <w:spacing w:after="80"/>
-      </w:pPr>
-      <w:r>
-        <w:t xml:space="preserve">Stories without a fixture script use the base seed data. If a precondition no longer matches what is in the database, record the case as </w:t>
-      </w:r>
-      <w:r>
-        <w:rPr>
-          <w:rFonts w:ascii="Consolas" w:cs="Consolas" w:eastAsia="Consolas" w:hAnsi="Consolas"/>
-          <w:sz w:val="20"/>
-          <w:szCs w:val="20"/>
-        </w:rPr>
-        <w:t xml:space="preserve">Blocked</w:t>
-      </w:r>
-      <w:r>
-        <w:t xml:space="preserve"> and move on. Do not reseed to fix it.</w:t>
-      </w:r>
-    </w:p>
-    <w:p>
-      <w:pPr>
-        <w:pStyle w:val="Heading1"/>
-      </w:pPr>
-      <w:r>
-        <w:t xml:space="preserve">Step 5: Run the selected cases and the smoke run</w:t>
+        <w:t xml:space="preserve">Do the smoke run first, together, before splitting up.</w:t>
       </w:r>
     </w:p>
     <w:p>
@@ -789,361 +755,336 @@
           <w:b/>
           <w:bCs/>
         </w:rPr>
-        <w:t xml:space="preserve">Selected cases.</w:t>
-      </w:r>
-      <w:r>
-        <w:t xml:space="preserve"> Open each story's workbook, follow the steps for the selected cases, and compare with the expected results. Do not type into the workbook.</w:t>
-      </w:r>
-    </w:p>
-    <w:p>
-      <w:pPr>
-        <w:spacing w:after="140"/>
-      </w:pPr>
+        <w:t xml:space="preserve">Smoke run.</w:t>
+      </w:r>
+      <w:r>
+        <w:t xml:space="preserve"> Take one new event through the whole flow, logging in as each role in turn. Create a new event for this, titled </w:t>
+      </w:r>
+      <w:r>
+        <w:rPr>
+          <w:rFonts w:ascii="Consolas" w:cs="Consolas" w:eastAsia="Consolas" w:hAnsi="Consolas"/>
+          <w:sz w:val="20"/>
+          <w:szCs w:val="20"/>
+        </w:rPr>
+        <w:t xml:space="preserve">REG S&lt;N&gt; &lt;your name&gt;</w:t>
+      </w:r>
+      <w:r>
+        <w:t xml:space="preserve">, so no story's fixtures are touched. The tracker's </w:t>
+      </w:r>
       <w:r>
         <w:rPr>
           <w:b/>
           <w:bCs/>
         </w:rPr>
-        <w:t xml:space="preserve">Smoke run.</w:t>
-      </w:r>
-      <w:r>
-        <w:t xml:space="preserve"> Take one new event through the whole flow, logging in as each role in turn. Create a new event for this, titled </w:t>
-      </w:r>
-      <w:r>
-        <w:rPr>
-          <w:rFonts w:ascii="Consolas" w:cs="Consolas" w:eastAsia="Consolas" w:hAnsi="Consolas"/>
-          <w:sz w:val="20"/>
-          <w:szCs w:val="20"/>
-        </w:rPr>
-        <w:t xml:space="preserve">REG S&lt;N&gt; &lt;your name&gt;</w:t>
-      </w:r>
-      <w:r>
-        <w:t xml:space="preserve">, so no story's fixtures are touched. The tracker's </w:t>
+        <w:t xml:space="preserve">Smoke run</w:t>
+      </w:r>
+      <w:r>
+        <w:t xml:space="preserve"> sheet has the accounts and what to check at each step. As of sprint 3 the flow is:</w:t>
+      </w:r>
+    </w:p>
+    <w:p>
+      <w:pPr>
+        <w:pStyle w:val="ListParagraph"/>
+        <w:numPr>
+          <w:ilvl w:val="0"/>
+          <w:numId w:val="4"/>
+        </w:numPr>
+        <w:spacing w:after="80"/>
+      </w:pPr>
+      <w:r>
+        <w:t xml:space="preserve">Event Organiser logs in, creates an event request, saves it as a draft, reopens it and submits it.</w:t>
+      </w:r>
+    </w:p>
+    <w:p>
+      <w:pPr>
+        <w:pStyle w:val="ListParagraph"/>
+        <w:numPr>
+          <w:ilvl w:val="0"/>
+          <w:numId w:val="4"/>
+        </w:numPr>
+        <w:spacing w:after="80"/>
+      </w:pPr>
+      <w:r>
+        <w:t xml:space="preserve">Event Operations Manager assigns an Event Coordinator.</w:t>
+      </w:r>
+    </w:p>
+    <w:p>
+      <w:pPr>
+        <w:pStyle w:val="ListParagraph"/>
+        <w:numPr>
+          <w:ilvl w:val="0"/>
+          <w:numId w:val="4"/>
+        </w:numPr>
+        <w:spacing w:after="80"/>
+      </w:pPr>
+      <w:r>
+        <w:t xml:space="preserve">Event Coordinator reviews and approves the request, then begins planning.</w:t>
+      </w:r>
+    </w:p>
+    <w:p>
+      <w:pPr>
+        <w:pStyle w:val="ListParagraph"/>
+        <w:numPr>
+          <w:ilvl w:val="0"/>
+          <w:numId w:val="4"/>
+        </w:numPr>
+        <w:spacing w:after="80"/>
+      </w:pPr>
+      <w:r>
+        <w:t xml:space="preserve">Event Coordinator makes an ordinary edit to the event information.</w:t>
+      </w:r>
+    </w:p>
+    <w:p>
+      <w:pPr>
+        <w:pStyle w:val="ListParagraph"/>
+        <w:numPr>
+          <w:ilvl w:val="0"/>
+          <w:numId w:val="4"/>
+        </w:numPr>
+        <w:spacing w:after="80"/>
+      </w:pPr>
+      <w:r>
+        <w:t xml:space="preserve">Event Coordinator searches for venues and requests two venues for the same times, each for its own purpose, attendance and layout.</w:t>
+      </w:r>
+    </w:p>
+    <w:p>
+      <w:pPr>
+        <w:pStyle w:val="ListParagraph"/>
+        <w:numPr>
+          <w:ilvl w:val="0"/>
+          <w:numId w:val="4"/>
+        </w:numPr>
+        <w:spacing w:after="80"/>
+      </w:pPr>
+      <w:r>
+        <w:t xml:space="preserve">Event Coordinator records the equipment required.</w:t>
+      </w:r>
+    </w:p>
+    <w:p>
+      <w:pPr>
+        <w:pStyle w:val="ListParagraph"/>
+        <w:numPr>
+          <w:ilvl w:val="0"/>
+          <w:numId w:val="4"/>
+        </w:numPr>
+        <w:spacing w:after="80"/>
+      </w:pPr>
+      <w:r>
+        <w:t xml:space="preserve">Technical Support Staff checks equipment availability and reserves it, then marks an unrelated item under maintenance and returns it.</w:t>
+      </w:r>
+    </w:p>
+    <w:p>
+      <w:pPr>
+        <w:pStyle w:val="ListParagraph"/>
+        <w:numPr>
+          <w:ilvl w:val="0"/>
+          <w:numId w:val="4"/>
+        </w:numPr>
+        <w:spacing w:after="80"/>
+      </w:pPr>
+      <w:r>
+        <w:t xml:space="preserve">Venue Staff approves both booking requests.</w:t>
+      </w:r>
+    </w:p>
+    <w:p>
+      <w:pPr>
+        <w:pStyle w:val="ListParagraph"/>
+        <w:numPr>
+          <w:ilvl w:val="0"/>
+          <w:numId w:val="4"/>
+        </w:numPr>
+        <w:spacing w:after="80"/>
+      </w:pPr>
+      <w:r>
+        <w:t xml:space="preserve">Venue Staff marks one of the two venues unavailable over the event's times.</w:t>
+      </w:r>
+    </w:p>
+    <w:p>
+      <w:pPr>
+        <w:pStyle w:val="ListParagraph"/>
+        <w:numPr>
+          <w:ilvl w:val="0"/>
+          <w:numId w:val="4"/>
+        </w:numPr>
+        <w:spacing w:after="80"/>
+      </w:pPr>
+      <w:r>
+        <w:t xml:space="preserve">Event Coordinator sees the notification and the flagged booking.</w:t>
+      </w:r>
+    </w:p>
+    <w:p>
+      <w:pPr>
+        <w:pStyle w:val="ListParagraph"/>
+        <w:numPr>
+          <w:ilvl w:val="0"/>
+          <w:numId w:val="4"/>
+        </w:numPr>
+        <w:spacing w:after="80"/>
+      </w:pPr>
+      <w:r>
+        <w:t xml:space="preserve">Event Coordinator requests a replacement venue and releases the flagged booking.</w:t>
+      </w:r>
+    </w:p>
+    <w:p>
+      <w:pPr>
+        <w:pStyle w:val="ListParagraph"/>
+        <w:numPr>
+          <w:ilvl w:val="0"/>
+          <w:numId w:val="4"/>
+        </w:numPr>
+        <w:spacing w:after="80"/>
+      </w:pPr>
+      <w:r>
+        <w:t xml:space="preserve">Venue Staff approves the replacement.</w:t>
+      </w:r>
+    </w:p>
+    <w:p>
+      <w:pPr>
+        <w:pStyle w:val="ListParagraph"/>
+        <w:numPr>
+          <w:ilvl w:val="0"/>
+          <w:numId w:val="4"/>
+        </w:numPr>
+        <w:spacing w:after="80"/>
+      </w:pPr>
+      <w:r>
+        <w:t xml:space="preserve">Event Coordinator sets up registration and tries to confirm the event, which is refused for the missing safety check.</w:t>
+      </w:r>
+    </w:p>
+    <w:p>
+      <w:pPr>
+        <w:pStyle w:val="ListParagraph"/>
+        <w:numPr>
+          <w:ilvl w:val="0"/>
+          <w:numId w:val="4"/>
+        </w:numPr>
+        <w:spacing w:after="80"/>
+      </w:pPr>
+      <w:r>
+        <w:t xml:space="preserve">Event Coordinator submits the event for a safety check.</w:t>
+      </w:r>
+    </w:p>
+    <w:p>
+      <w:pPr>
+        <w:pStyle w:val="ListParagraph"/>
+        <w:numPr>
+          <w:ilvl w:val="0"/>
+          <w:numId w:val="4"/>
+        </w:numPr>
+        <w:spacing w:after="80"/>
+      </w:pPr>
+      <w:r>
+        <w:t xml:space="preserve">Safety Officer requests changes.</w:t>
+      </w:r>
+    </w:p>
+    <w:p>
+      <w:pPr>
+        <w:pStyle w:val="ListParagraph"/>
+        <w:numPr>
+          <w:ilvl w:val="0"/>
+          <w:numId w:val="4"/>
+        </w:numPr>
+        <w:spacing w:after="80"/>
+      </w:pPr>
+      <w:r>
+        <w:t xml:space="preserve">Event Coordinator reads the decision and resubmits; the organiser cannot see the reason.</w:t>
+      </w:r>
+    </w:p>
+    <w:p>
+      <w:pPr>
+        <w:pStyle w:val="ListParagraph"/>
+        <w:numPr>
+          <w:ilvl w:val="0"/>
+          <w:numId w:val="4"/>
+        </w:numPr>
+        <w:spacing w:after="80"/>
+      </w:pPr>
+      <w:r>
+        <w:t xml:space="preserve">Safety Officer approves, and the Event Coordinator confirms the event.</w:t>
+      </w:r>
+    </w:p>
+    <w:p>
+      <w:pPr>
+        <w:pStyle w:val="ListParagraph"/>
+        <w:numPr>
+          <w:ilvl w:val="0"/>
+          <w:numId w:val="4"/>
+        </w:numPr>
+        <w:spacing w:after="80"/>
+      </w:pPr>
+      <w:r>
+        <w:t xml:space="preserve">An Attendee registers for the event, then withdraws.</w:t>
+      </w:r>
+    </w:p>
+    <w:p>
+      <w:pPr>
+        <w:pStyle w:val="ListParagraph"/>
+        <w:numPr>
+          <w:ilvl w:val="0"/>
+          <w:numId w:val="4"/>
+        </w:numPr>
+        <w:spacing w:after="80"/>
+      </w:pPr>
+      <w:r>
+        <w:t xml:space="preserve">The organiser and the coordinator see the withdrawal on the registration list.</w:t>
+      </w:r>
+    </w:p>
+    <w:p>
+      <w:pPr>
+        <w:pStyle w:val="ListParagraph"/>
+        <w:numPr>
+          <w:ilvl w:val="0"/>
+          <w:numId w:val="4"/>
+        </w:numPr>
+        <w:spacing w:after="80"/>
+      </w:pPr>
+      <w:r>
+        <w:t xml:space="preserve">Each role sees only its own sidebar links, and the organiser sees only their own events.</w:t>
+      </w:r>
+    </w:p>
+    <w:p>
+      <w:pPr>
+        <w:spacing w:after="140"/>
+      </w:pPr>
+      <w:r>
+        <w:t xml:space="preserve">When a sprint adds a step to the flow, add it to this list in the same pull request as the story.</w:t>
+      </w:r>
+    </w:p>
+    <w:p>
+      <w:pPr>
+        <w:pStyle w:val="Heading1"/>
+      </w:pPr>
+      <w:r>
+        <w:t xml:space="preserve">Step 6: Record the results</w:t>
+      </w:r>
+    </w:p>
+    <w:p>
+      <w:pPr>
+        <w:spacing w:after="140"/>
+      </w:pPr>
+      <w:r>
+        <w:t xml:space="preserve">Results go in the sprint's regression log, an Excel tracker at </w:t>
+      </w:r>
+      <w:r>
+        <w:rPr>
+          <w:rFonts w:ascii="Consolas" w:cs="Consolas" w:eastAsia="Consolas" w:hAnsi="Consolas"/>
+          <w:sz w:val="20"/>
+          <w:szCs w:val="20"/>
+        </w:rPr>
+        <w:t xml:space="preserve">docs/regression/Sprint-&lt;N&gt;_Regression.xlsx</w:t>
+      </w:r>
+      <w:r>
+        <w:t xml:space="preserve">. To start a new one, copy the previous sprint's tracker, rename it, and clear the yellow cells. Then replace the rows on the </w:t>
       </w:r>
       <w:r>
         <w:rPr>
           <w:b/>
           <w:bCs/>
         </w:rPr>
-        <w:t xml:space="preserve">Smoke run</w:t>
-      </w:r>
-      <w:r>
-        <w:t xml:space="preserve"> sheet has the accounts and what to check at each step. As of sprint 3 the flow is:</w:t>
-      </w:r>
-    </w:p>
-    <w:p>
-      <w:pPr>
-        <w:pStyle w:val="ListParagraph"/>
-        <w:numPr>
-          <w:ilvl w:val="0"/>
-          <w:numId w:val="4"/>
-        </w:numPr>
-        <w:spacing w:after="80"/>
-      </w:pPr>
-      <w:r>
-        <w:t xml:space="preserve">Event Organiser logs in, creates an event request, saves it as a draft, reopens it and submits it.</w:t>
-      </w:r>
-    </w:p>
-    <w:p>
-      <w:pPr>
-        <w:pStyle w:val="ListParagraph"/>
-        <w:numPr>
-          <w:ilvl w:val="0"/>
-          <w:numId w:val="4"/>
-        </w:numPr>
-        <w:spacing w:after="80"/>
-      </w:pPr>
-      <w:r>
-        <w:t xml:space="preserve">Event Operations Manager assigns an Event Coordinator.</w:t>
-      </w:r>
-    </w:p>
-    <w:p>
-      <w:pPr>
-        <w:pStyle w:val="ListParagraph"/>
-        <w:numPr>
-          <w:ilvl w:val="0"/>
-          <w:numId w:val="4"/>
-        </w:numPr>
-        <w:spacing w:after="80"/>
-      </w:pPr>
-      <w:r>
-        <w:t xml:space="preserve">Event Coordinator reviews and approves the request, then begins planning.</w:t>
-      </w:r>
-    </w:p>
-    <w:p>
-      <w:pPr>
-        <w:pStyle w:val="ListParagraph"/>
-        <w:numPr>
-          <w:ilvl w:val="0"/>
-          <w:numId w:val="4"/>
-        </w:numPr>
-        <w:spacing w:after="80"/>
-      </w:pPr>
-      <w:r>
-        <w:t xml:space="preserve">Event Coordinator makes an ordinary edit to the event information.</w:t>
-      </w:r>
-    </w:p>
-    <w:p>
-      <w:pPr>
-        <w:pStyle w:val="ListParagraph"/>
-        <w:numPr>
-          <w:ilvl w:val="0"/>
-          <w:numId w:val="4"/>
-        </w:numPr>
-        <w:spacing w:after="80"/>
-      </w:pPr>
-      <w:r>
-        <w:t xml:space="preserve">Event Coordinator searches for venues and requests two venues for the same times, each for its own purpose, attendance and layout.</w:t>
-      </w:r>
-    </w:p>
-    <w:p>
-      <w:pPr>
-        <w:pStyle w:val="ListParagraph"/>
-        <w:numPr>
-          <w:ilvl w:val="0"/>
-          <w:numId w:val="4"/>
-        </w:numPr>
-        <w:spacing w:after="80"/>
-      </w:pPr>
-      <w:r>
-        <w:t xml:space="preserve">Event Coordinator records the equipment required.</w:t>
-      </w:r>
-    </w:p>
-    <w:p>
-      <w:pPr>
-        <w:pStyle w:val="ListParagraph"/>
-        <w:numPr>
-          <w:ilvl w:val="0"/>
-          <w:numId w:val="4"/>
-        </w:numPr>
-        <w:spacing w:after="80"/>
-      </w:pPr>
-      <w:r>
-        <w:t xml:space="preserve">Technical Support Staff checks equipment availability and reserves it, then marks an unrelated item under maintenance and returns it.</w:t>
-      </w:r>
-    </w:p>
-    <w:p>
-      <w:pPr>
-        <w:pStyle w:val="ListParagraph"/>
-        <w:numPr>
-          <w:ilvl w:val="0"/>
-          <w:numId w:val="4"/>
-        </w:numPr>
-        <w:spacing w:after="80"/>
-      </w:pPr>
-      <w:r>
-        <w:t xml:space="preserve">Venue Staff approves both booking requests.</w:t>
-      </w:r>
-    </w:p>
-    <w:p>
-      <w:pPr>
-        <w:pStyle w:val="ListParagraph"/>
-        <w:numPr>
-          <w:ilvl w:val="0"/>
-          <w:numId w:val="4"/>
-        </w:numPr>
-        <w:spacing w:after="80"/>
-      </w:pPr>
-      <w:r>
-        <w:t xml:space="preserve">Venue Staff marks one of the two venues unavailable over the event's times.</w:t>
-      </w:r>
-    </w:p>
-    <w:p>
-      <w:pPr>
-        <w:pStyle w:val="ListParagraph"/>
-        <w:numPr>
-          <w:ilvl w:val="0"/>
-          <w:numId w:val="4"/>
-        </w:numPr>
-        <w:spacing w:after="80"/>
-      </w:pPr>
-      <w:r>
-        <w:t xml:space="preserve">Event Coordinator sees the notification and the flagged booking.</w:t>
-      </w:r>
-    </w:p>
-    <w:p>
-      <w:pPr>
-        <w:pStyle w:val="ListParagraph"/>
-        <w:numPr>
-          <w:ilvl w:val="0"/>
-          <w:numId w:val="4"/>
-        </w:numPr>
-        <w:spacing w:after="80"/>
-      </w:pPr>
-      <w:r>
-        <w:t xml:space="preserve">Event Coordinator requests a replacement venue and releases the flagged booking.</w:t>
-      </w:r>
-    </w:p>
-    <w:p>
-      <w:pPr>
-        <w:pStyle w:val="ListParagraph"/>
-        <w:numPr>
-          <w:ilvl w:val="0"/>
-          <w:numId w:val="4"/>
-        </w:numPr>
-        <w:spacing w:after="80"/>
-      </w:pPr>
-      <w:r>
-        <w:t xml:space="preserve">Venue Staff approves the replacement.</w:t>
-      </w:r>
-    </w:p>
-    <w:p>
-      <w:pPr>
-        <w:pStyle w:val="ListParagraph"/>
-        <w:numPr>
-          <w:ilvl w:val="0"/>
-          <w:numId w:val="4"/>
-        </w:numPr>
-        <w:spacing w:after="80"/>
-      </w:pPr>
-      <w:r>
-        <w:t xml:space="preserve">Event Coordinator sets up registration and tries to confirm the event, which is refused for the missing safety check.</w:t>
-      </w:r>
-    </w:p>
-    <w:p>
-      <w:pPr>
-        <w:pStyle w:val="ListParagraph"/>
-        <w:numPr>
-          <w:ilvl w:val="0"/>
-          <w:numId w:val="4"/>
-        </w:numPr>
-        <w:spacing w:after="80"/>
-      </w:pPr>
-      <w:r>
-        <w:t xml:space="preserve">Event Coordinator submits the event for a safety check.</w:t>
-      </w:r>
-    </w:p>
-    <w:p>
-      <w:pPr>
-        <w:pStyle w:val="ListParagraph"/>
-        <w:numPr>
-          <w:ilvl w:val="0"/>
-          <w:numId w:val="4"/>
-        </w:numPr>
-        <w:spacing w:after="80"/>
-      </w:pPr>
-      <w:r>
-        <w:t xml:space="preserve">Safety Officer requests changes.</w:t>
-      </w:r>
-    </w:p>
-    <w:p>
-      <w:pPr>
-        <w:pStyle w:val="ListParagraph"/>
-        <w:numPr>
-          <w:ilvl w:val="0"/>
-          <w:numId w:val="4"/>
-        </w:numPr>
-        <w:spacing w:after="80"/>
-      </w:pPr>
-      <w:r>
-        <w:t xml:space="preserve">Event Coordinator reads the decision and resubmits; the organiser cannot see the reason.</w:t>
-      </w:r>
-    </w:p>
-    <w:p>
-      <w:pPr>
-        <w:pStyle w:val="ListParagraph"/>
-        <w:numPr>
-          <w:ilvl w:val="0"/>
-          <w:numId w:val="4"/>
-        </w:numPr>
-        <w:spacing w:after="80"/>
-      </w:pPr>
-      <w:r>
-        <w:t xml:space="preserve">Safety Officer approves, and the Event Coordinator confirms the event.</w:t>
-      </w:r>
-    </w:p>
-    <w:p>
-      <w:pPr>
-        <w:pStyle w:val="ListParagraph"/>
-        <w:numPr>
-          <w:ilvl w:val="0"/>
-          <w:numId w:val="4"/>
-        </w:numPr>
-        <w:spacing w:after="80"/>
-      </w:pPr>
-      <w:r>
-        <w:t xml:space="preserve">An Attendee registers for the event, then withdraws.</w:t>
-      </w:r>
-    </w:p>
-    <w:p>
-      <w:pPr>
-        <w:pStyle w:val="ListParagraph"/>
-        <w:numPr>
-          <w:ilvl w:val="0"/>
-          <w:numId w:val="4"/>
-        </w:numPr>
-        <w:spacing w:after="80"/>
-      </w:pPr>
-      <w:r>
-        <w:t xml:space="preserve">The organiser and the coordinator see the withdrawal on the registration list.</w:t>
-      </w:r>
-    </w:p>
-    <w:p>
-      <w:pPr>
-        <w:pStyle w:val="ListParagraph"/>
-        <w:numPr>
-          <w:ilvl w:val="0"/>
-          <w:numId w:val="4"/>
-        </w:numPr>
-        <w:spacing w:after="80"/>
-      </w:pPr>
-      <w:r>
-        <w:t xml:space="preserve">Each role sees only its own sidebar links, and the organiser sees only their own events.</w:t>
-      </w:r>
-    </w:p>
-    <w:p>
-      <w:pPr>
-        <w:spacing w:after="140"/>
-      </w:pPr>
-      <w:r>
-        <w:t xml:space="preserve">When a sprint adds a step to the flow, add it to this list in the same pull request as the story.</w:t>
-      </w:r>
-    </w:p>
-    <w:p>
-      <w:pPr>
-        <w:pStyle w:val="Heading1"/>
-      </w:pPr>
-      <w:r>
-        <w:t xml:space="preserve">Step 6: Record the results</w:t>
-      </w:r>
-    </w:p>
-    <w:p>
-      <w:pPr>
-        <w:spacing w:after="140"/>
-      </w:pPr>
-      <w:r>
-        <w:t xml:space="preserve">Results go in the sprint's regression log, an Excel tracker at </w:t>
-      </w:r>
-      <w:r>
-        <w:rPr>
-          <w:rFonts w:ascii="Consolas" w:cs="Consolas" w:eastAsia="Consolas" w:hAnsi="Consolas"/>
-          <w:sz w:val="20"/>
-          <w:szCs w:val="20"/>
-        </w:rPr>
-        <w:t xml:space="preserve">docs/regression/Sprint-&lt;N&gt;_Regression.xlsx</w:t>
-      </w:r>
-      <w:r>
-        <w:t xml:space="preserve">. To start a new one, copy the previous sprint's tracker, rename it, and clear the yellow cells. Then replace the rows on the </w:t>
-      </w:r>
-      <w:r>
-        <w:rPr>
-          <w:b/>
-          <w:bCs/>
-        </w:rPr>
         <w:t xml:space="preserve">Scope</w:t>
       </w:r>
       <w:r>
-        <w:t xml:space="preserve"> and </w:t>
-      </w:r>
-      <w:r>
-        <w:rPr>
-          <w:b/>
-          <w:bCs/>
-        </w:rPr>
-        <w:t xml:space="preserve">Retested cases</w:t>
-      </w:r>
-      <w:r>
-        <w:t xml:space="preserve"> sheets with this sprint's (steps 2 and 3).</w:t>
+        <w:t xml:space="preserve"> sheet and the testers' sheets with this sprint's (steps 2 and 3).</w:t>
       </w:r>
     </w:p>
     <w:tbl>
@@ -1159,8 +1100,8 @@
         </w:tblBorders>
       </w:tblPr>
       <w:tblGrid>
-        <w:gridCol w:w="1992"/>
-        <w:gridCol w:w="7034"/>
+        <w:gridCol w:w="2256"/>
+        <w:gridCol w:w="6770"/>
       </w:tblGrid>
       <w:tr>
         <w:trPr>
@@ -1168,7 +1109,7 @@
         </w:trPr>
         <w:tc>
           <w:tcPr>
-            <w:tcW w:type="dxa" w:w="1992"/>
+            <w:tcW w:type="dxa" w:w="2256"/>
             <w:tcBorders>
               <w:top w:val="single" w:color="BFBFBF" w:sz="4"/>
               <w:left w:val="single" w:color="BFBFBF" w:sz="4"/>
@@ -1195,7 +1136,7 @@
         </w:tc>
         <w:tc>
           <w:tcPr>
-            <w:tcW w:type="dxa" w:w="7034"/>
+            <w:tcW w:type="dxa" w:w="6770"/>
             <w:tcBorders>
               <w:top w:val="single" w:color="BFBFBF" w:sz="4"/>
               <w:left w:val="single" w:color="BFBFBF" w:sz="4"/>
@@ -1227,7 +1168,7 @@
         </w:trPr>
         <w:tc>
           <w:tcPr>
-            <w:tcW w:type="dxa" w:w="1992"/>
+            <w:tcW w:type="dxa" w:w="2256"/>
             <w:tcBorders>
               <w:top w:val="single" w:color="BFBFBF" w:sz="4"/>
               <w:left w:val="single" w:color="BFBFBF" w:sz="4"/>
@@ -1249,7 +1190,7 @@
         </w:tc>
         <w:tc>
           <w:tcPr>
-            <w:tcW w:type="dxa" w:w="7034"/>
+            <w:tcW w:type="dxa" w:w="6770"/>
             <w:tcBorders>
               <w:top w:val="single" w:color="BFBFBF" w:sz="4"/>
               <w:left w:val="single" w:color="BFBFBF" w:sz="4"/>
@@ -1265,7 +1206,7 @@
           </w:tcPr>
           <w:p>
             <w:r>
-              <w:t xml:space="preserve">Date, testers and the commit tested. The result counts fill in by themselves.</w:t>
+              <w:t xml:space="preserve">Date, testers and the commit tested, the three automated checks (step 1), and the result counts per tester, which fill in by themselves.</w:t>
             </w:r>
           </w:p>
         </w:tc>
@@ -1276,7 +1217,7 @@
         </w:trPr>
         <w:tc>
           <w:tcPr>
-            <w:tcW w:type="dxa" w:w="1992"/>
+            <w:tcW w:type="dxa" w:w="2256"/>
             <w:tcBorders>
               <w:top w:val="single" w:color="BFBFBF" w:sz="4"/>
               <w:left w:val="single" w:color="BFBFBF" w:sz="4"/>
@@ -1292,13 +1233,13 @@
           </w:tcPr>
           <w:p>
             <w:r>
-              <w:t xml:space="preserve">Testers</w:t>
+              <w:t xml:space="preserve">Smoke run</w:t>
             </w:r>
           </w:p>
         </w:tc>
         <w:tc>
           <w:tcPr>
-            <w:tcW w:type="dxa" w:w="7034"/>
+            <w:tcW w:type="dxa" w:w="6770"/>
             <w:tcBorders>
               <w:top w:val="single" w:color="BFBFBF" w:sz="4"/>
               <w:left w:val="single" w:color="BFBFBF" w:sz="4"/>
@@ -1314,7 +1255,7 @@
           </w:tcPr>
           <w:p>
             <w:r>
-              <w:t xml:space="preserve">Who retests which area, with each tester's case count and progress. Nobody retests their own stories from this sprint.</w:t>
+              <w:t xml:space="preserve">The result of each step of the smoke run.</w:t>
             </w:r>
           </w:p>
         </w:tc>
@@ -1325,7 +1266,7 @@
         </w:trPr>
         <w:tc>
           <w:tcPr>
-            <w:tcW w:type="dxa" w:w="1992"/>
+            <w:tcW w:type="dxa" w:w="2256"/>
             <w:tcBorders>
               <w:top w:val="single" w:color="BFBFBF" w:sz="4"/>
               <w:left w:val="single" w:color="BFBFBF" w:sz="4"/>
@@ -1341,13 +1282,13 @@
           </w:tcPr>
           <w:p>
             <w:r>
-              <w:t xml:space="preserve">Retested cases</w:t>
+              <w:t xml:space="preserve">One sheet per tester</w:t>
             </w:r>
           </w:p>
         </w:tc>
         <w:tc>
           <w:tcPr>
-            <w:tcW w:type="dxa" w:w="7034"/>
+            <w:tcW w:type="dxa" w:w="6770"/>
             <w:tcBorders>
               <w:top w:val="single" w:color="BFBFBF" w:sz="4"/>
               <w:left w:val="single" w:color="BFBFBF" w:sz="4"/>
@@ -1363,7 +1304,18 @@
           </w:tcPr>
           <w:p>
             <w:r>
-              <w:t xml:space="preserve">One row per selected case: who it is assigned to, the result, who tested it, the date and notes.</w:t>
+              <w:t xml:space="preserve">That tester's cases in run order, each with its preconditions, test data, steps and expected results, then the result, date and notes. IDs ending in </w:t>
+            </w:r>
+            <w:r>
+              <w:rPr>
+                <w:rFonts w:ascii="Consolas" w:cs="Consolas" w:eastAsia="Consolas" w:hAnsi="Consolas"/>
+                <w:sz w:val="20"/>
+                <w:szCs w:val="20"/>
+              </w:rPr>
+              <w:t xml:space="preserve">-R</w:t>
+            </w:r>
+            <w:r>
+              <w:t xml:space="preserve"> were rewritten for this run.</w:t>
             </w:r>
           </w:p>
         </w:tc>
@@ -1374,7 +1326,7 @@
         </w:trPr>
         <w:tc>
           <w:tcPr>
-            <w:tcW w:type="dxa" w:w="1992"/>
+            <w:tcW w:type="dxa" w:w="2256"/>
             <w:tcBorders>
               <w:top w:val="single" w:color="BFBFBF" w:sz="4"/>
               <w:left w:val="single" w:color="BFBFBF" w:sz="4"/>
@@ -1390,13 +1342,13 @@
           </w:tcPr>
           <w:p>
             <w:r>
-              <w:t xml:space="preserve">Rewritten cases</w:t>
+              <w:t xml:space="preserve">Out-of-date cases</w:t>
             </w:r>
           </w:p>
         </w:tc>
         <w:tc>
           <w:tcPr>
-            <w:tcW w:type="dxa" w:w="7034"/>
+            <w:tcW w:type="dxa" w:w="6770"/>
             <w:tcBorders>
               <w:top w:val="single" w:color="BFBFBF" w:sz="4"/>
               <w:left w:val="single" w:color="BFBFBF" w:sz="4"/>
@@ -1412,18 +1364,7 @@
           </w:tcPr>
           <w:p>
             <w:r>
-              <w:t xml:space="preserve">Steps and expected results for selected cases whose story workbook is out of date. Their IDs end in </w:t>
-            </w:r>
-            <w:r>
-              <w:rPr>
-                <w:rFonts w:ascii="Consolas" w:cs="Consolas" w:eastAsia="Consolas" w:hAnsi="Consolas"/>
-                <w:sz w:val="20"/>
-                <w:szCs w:val="20"/>
-              </w:rPr>
-              <w:t xml:space="preserve">-R</w:t>
-            </w:r>
-            <w:r>
-              <w:t xml:space="preserve">.</w:t>
+              <w:t xml:space="preserve">Every story test case that a later story has made out of date, which story changed it, and whether its owner has updated it.</w:t>
             </w:r>
           </w:p>
         </w:tc>
@@ -1434,7 +1375,7 @@
         </w:trPr>
         <w:tc>
           <w:tcPr>
-            <w:tcW w:type="dxa" w:w="1992"/>
+            <w:tcW w:type="dxa" w:w="2256"/>
             <w:tcBorders>
               <w:top w:val="single" w:color="BFBFBF" w:sz="4"/>
               <w:left w:val="single" w:color="BFBFBF" w:sz="4"/>
@@ -1450,13 +1391,13 @@
           </w:tcPr>
           <w:p>
             <w:r>
-              <w:t xml:space="preserve">Out-of-date cases</w:t>
+              <w:t xml:space="preserve">Scope</w:t>
             </w:r>
           </w:p>
         </w:tc>
         <w:tc>
           <w:tcPr>
-            <w:tcW w:type="dxa" w:w="7034"/>
+            <w:tcW w:type="dxa" w:w="6770"/>
             <w:tcBorders>
               <w:top w:val="single" w:color="BFBFBF" w:sz="4"/>
               <w:left w:val="single" w:color="BFBFBF" w:sz="4"/>
@@ -1472,203 +1413,7 @@
           </w:tcPr>
           <w:p>
             <w:r>
-              <w:t xml:space="preserve">Every story test case that a later story has made out of date, which story changed it, and whether it has been updated.</w:t>
-            </w:r>
-          </w:p>
-        </w:tc>
-      </w:tr>
-      <w:tr>
-        <w:trPr>
-          <w:tblHeader w:val="off"/>
-        </w:trPr>
-        <w:tc>
-          <w:tcPr>
-            <w:tcW w:type="dxa" w:w="1992"/>
-            <w:tcBorders>
-              <w:top w:val="single" w:color="BFBFBF" w:sz="4"/>
-              <w:left w:val="single" w:color="BFBFBF" w:sz="4"/>
-              <w:bottom w:val="single" w:color="BFBFBF" w:sz="4"/>
-              <w:right w:val="single" w:color="BFBFBF" w:sz="4"/>
-            </w:tcBorders>
-            <w:tcMar>
-              <w:top w:type="dxa" w:w="80"/>
-              <w:left w:type="dxa" w:w="120"/>
-              <w:bottom w:type="dxa" w:w="80"/>
-              <w:right w:type="dxa" w:w="120"/>
-            </w:tcMar>
-          </w:tcPr>
-          <w:p>
-            <w:r>
-              <w:t xml:space="preserve">Automated checks</w:t>
-            </w:r>
-          </w:p>
-        </w:tc>
-        <w:tc>
-          <w:tcPr>
-            <w:tcW w:type="dxa" w:w="7034"/>
-            <w:tcBorders>
-              <w:top w:val="single" w:color="BFBFBF" w:sz="4"/>
-              <w:left w:val="single" w:color="BFBFBF" w:sz="4"/>
-              <w:bottom w:val="single" w:color="BFBFBF" w:sz="4"/>
-              <w:right w:val="single" w:color="BFBFBF" w:sz="4"/>
-            </w:tcBorders>
-            <w:tcMar>
-              <w:top w:type="dxa" w:w="80"/>
-              <w:left w:type="dxa" w:w="120"/>
-              <w:bottom w:type="dxa" w:w="80"/>
-              <w:right w:type="dxa" w:w="120"/>
-            </w:tcMar>
-          </w:tcPr>
-          <w:p>
-            <w:r>
-              <w:t xml:space="preserve">The result of each command in step 1.</w:t>
-            </w:r>
-          </w:p>
-        </w:tc>
-      </w:tr>
-      <w:tr>
-        <w:trPr>
-          <w:tblHeader w:val="off"/>
-        </w:trPr>
-        <w:tc>
-          <w:tcPr>
-            <w:tcW w:type="dxa" w:w="1992"/>
-            <w:tcBorders>
-              <w:top w:val="single" w:color="BFBFBF" w:sz="4"/>
-              <w:left w:val="single" w:color="BFBFBF" w:sz="4"/>
-              <w:bottom w:val="single" w:color="BFBFBF" w:sz="4"/>
-              <w:right w:val="single" w:color="BFBFBF" w:sz="4"/>
-            </w:tcBorders>
-            <w:tcMar>
-              <w:top w:type="dxa" w:w="80"/>
-              <w:left w:type="dxa" w:w="120"/>
-              <w:bottom w:type="dxa" w:w="80"/>
-              <w:right w:type="dxa" w:w="120"/>
-            </w:tcMar>
-          </w:tcPr>
-          <w:p>
-            <w:r>
-              <w:t xml:space="preserve">Scope</w:t>
-            </w:r>
-          </w:p>
-        </w:tc>
-        <w:tc>
-          <w:tcPr>
-            <w:tcW w:type="dxa" w:w="7034"/>
-            <w:tcBorders>
-              <w:top w:val="single" w:color="BFBFBF" w:sz="4"/>
-              <w:left w:val="single" w:color="BFBFBF" w:sz="4"/>
-              <w:bottom w:val="single" w:color="BFBFBF" w:sz="4"/>
-              <w:right w:val="single" w:color="BFBFBF" w:sz="4"/>
-            </w:tcBorders>
-            <w:tcMar>
-              <w:top w:type="dxa" w:w="80"/>
-              <w:left w:type="dxa" w:w="120"/>
-              <w:bottom w:type="dxa" w:w="80"/>
-              <w:right w:type="dxa" w:w="120"/>
-            </w:tcMar>
-          </w:tcPr>
-          <w:p>
-            <w:r>
               <w:t xml:space="preserve">Every earlier story, whether it is in scope, and why.</w:t>
-            </w:r>
-          </w:p>
-        </w:tc>
-      </w:tr>
-      <w:tr>
-        <w:trPr>
-          <w:tblHeader w:val="off"/>
-        </w:trPr>
-        <w:tc>
-          <w:tcPr>
-            <w:tcW w:type="dxa" w:w="1992"/>
-            <w:tcBorders>
-              <w:top w:val="single" w:color="BFBFBF" w:sz="4"/>
-              <w:left w:val="single" w:color="BFBFBF" w:sz="4"/>
-              <w:bottom w:val="single" w:color="BFBFBF" w:sz="4"/>
-              <w:right w:val="single" w:color="BFBFBF" w:sz="4"/>
-            </w:tcBorders>
-            <w:tcMar>
-              <w:top w:type="dxa" w:w="80"/>
-              <w:left w:type="dxa" w:w="120"/>
-              <w:bottom w:type="dxa" w:w="80"/>
-              <w:right w:type="dxa" w:w="120"/>
-            </w:tcMar>
-          </w:tcPr>
-          <w:p>
-            <w:r>
-              <w:t xml:space="preserve">Smoke run</w:t>
-            </w:r>
-          </w:p>
-        </w:tc>
-        <w:tc>
-          <w:tcPr>
-            <w:tcW w:type="dxa" w:w="7034"/>
-            <w:tcBorders>
-              <w:top w:val="single" w:color="BFBFBF" w:sz="4"/>
-              <w:left w:val="single" w:color="BFBFBF" w:sz="4"/>
-              <w:bottom w:val="single" w:color="BFBFBF" w:sz="4"/>
-              <w:right w:val="single" w:color="BFBFBF" w:sz="4"/>
-            </w:tcBorders>
-            <w:tcMar>
-              <w:top w:type="dxa" w:w="80"/>
-              <w:left w:type="dxa" w:w="120"/>
-              <w:bottom w:type="dxa" w:w="80"/>
-              <w:right w:type="dxa" w:w="120"/>
-            </w:tcMar>
-          </w:tcPr>
-          <w:p>
-            <w:r>
-              <w:t xml:space="preserve">The result of each step of the smoke run.</w:t>
-            </w:r>
-          </w:p>
-        </w:tc>
-      </w:tr>
-      <w:tr>
-        <w:trPr>
-          <w:tblHeader w:val="off"/>
-        </w:trPr>
-        <w:tc>
-          <w:tcPr>
-            <w:tcW w:type="dxa" w:w="1992"/>
-            <w:tcBorders>
-              <w:top w:val="single" w:color="BFBFBF" w:sz="4"/>
-              <w:left w:val="single" w:color="BFBFBF" w:sz="4"/>
-              <w:bottom w:val="single" w:color="BFBFBF" w:sz="4"/>
-              <w:right w:val="single" w:color="BFBFBF" w:sz="4"/>
-            </w:tcBorders>
-            <w:tcMar>
-              <w:top w:type="dxa" w:w="80"/>
-              <w:left w:type="dxa" w:w="120"/>
-              <w:bottom w:type="dxa" w:w="80"/>
-              <w:right w:type="dxa" w:w="120"/>
-            </w:tcMar>
-          </w:tcPr>
-          <w:p>
-            <w:r>
-              <w:t xml:space="preserve">Follow-ups</w:t>
-            </w:r>
-          </w:p>
-        </w:tc>
-        <w:tc>
-          <w:tcPr>
-            <w:tcW w:type="dxa" w:w="7034"/>
-            <w:tcBorders>
-              <w:top w:val="single" w:color="BFBFBF" w:sz="4"/>
-              <w:left w:val="single" w:color="BFBFBF" w:sz="4"/>
-              <w:bottom w:val="single" w:color="BFBFBF" w:sz="4"/>
-              <w:right w:val="single" w:color="BFBFBF" w:sz="4"/>
-            </w:tcBorders>
-            <w:tcMar>
-              <w:top w:type="dxa" w:w="80"/>
-              <w:left w:type="dxa" w:w="120"/>
-              <w:bottom w:type="dxa" w:w="80"/>
-              <w:right w:type="dxa" w:w="120"/>
-            </w:tcMar>
-          </w:tcPr>
-          <w:p>
-            <w:r>
-              <w:t xml:space="preserve">Bugs raised and test cases that need updating.</w:t>
             </w:r>
           </w:p>
         </w:tc>
@@ -1946,7 +1691,7 @@
           </w:tcPr>
           <w:p>
             <w:r>
-              <w:t xml:space="preserve">Raise a bug (step 7). Add a row to Follow-ups.</w:t>
+              <w:t xml:space="preserve">Raise a bug (step 7) and put its key in the case's notes.</w:t>
             </w:r>
           </w:p>
         </w:tc>
@@ -2017,7 +1762,17 @@
           </w:tcPr>
           <w:p>
             <w:r>
-              <w:t xml:space="preserve">Name the story that changed it in the notes. Add a row to Follow-ups.</w:t>
+              <w:t xml:space="preserve">Name the story that changed it in the notes, and add the case to </w:t>
+            </w:r>
+            <w:r>
+              <w:rPr>
+                <w:b/>
+                <w:bCs/>
+              </w:rPr>
+              <w:t xml:space="preserve">Out-of-date cases</w:t>
+            </w:r>
+            <w:r>
+              <w:t xml:space="preserve"> if it is not there already.</w:t>
             </w:r>
           </w:p>
         </w:tc>
@@ -2088,7 +1843,7 @@
           </w:tcPr>
           <w:p>
             <w:r>
-              <w:t xml:space="preserve">Say why in the notes. Add a row to Follow-ups.</w:t>
+              <w:t xml:space="preserve">Say why in the notes.</w:t>
             </w:r>
           </w:p>
         </w:tc>
@@ -2157,7 +1912,7 @@
         <w:spacing w:after="80"/>
       </w:pPr>
       <w:r>
-        <w:t xml:space="preserve">Decide as a team whether to fix it before the sprint review or carry it to the next sprint. Write the decision in the log.</w:t>
+        <w:t xml:space="preserve">Decide as a team whether to fix it before the sprint review or carry it to the next sprint. Write the decision in the case's notes.</w:t>
       </w:r>
     </w:p>
     <w:p>
@@ -2170,7 +1925,7 @@
         <w:spacing w:after="80"/>
       </w:pPr>
       <w:r>
-        <w:t xml:space="preserve">After a fix merges, rerun step 1 and the failed case, and add a second row for that case to the log. Keep the original </w:t>
+        <w:t xml:space="preserve">After a fix merges, rerun step 1 and the failed case, and add a second row for that case under the original on your sheet. Keep the original </w:t>
       </w:r>
       <w:r>
         <w:rPr>

</xml_diff>

<commit_message>
Split the Sprint 3 smoke run between the team as a relay
The Smoke run sheet gets a Who column (a dropdown that also takes free
text) assigning each step to the person playing that role, with the
coordinator's steps split between two people. Its note and the guide
describe running it as a relay on a call, each person logged in as
their own role(s). The Word copy of the guide is regenerated.

Co-Authored-By: Claude Opus 5.5 <noreply@anthropic.com>
</commit_message>
<xml_diff>
--- a/docs/Regression_Testing_Guide.docx
+++ b/docs/Regression_Testing_Guide.docx
@@ -743,7 +743,7 @@
         <w:spacing w:after="140"/>
       </w:pPr>
       <w:r>
-        <w:t xml:space="preserve">Do the smoke run first, together, before splitting up.</w:t>
+        <w:t xml:space="preserve">Do the smoke run first, together, before splitting up to work through your own sheets.</w:t>
       </w:r>
     </w:p>
     <w:p>
@@ -766,10 +766,10 @@
           <w:sz w:val="20"/>
           <w:szCs w:val="20"/>
         </w:rPr>
-        <w:t xml:space="preserve">REG S&lt;N&gt; &lt;your name&gt;</w:t>
-      </w:r>
-      <w:r>
-        <w:t xml:space="preserve">, so no story's fixtures are touched. The tracker's </w:t>
+        <w:t xml:space="preserve">REG S&lt;N&gt; Smoke</w:t>
+      </w:r>
+      <w:r>
+        <w:t xml:space="preserve">, so no story's fixtures are touched. Run it as a relay on a call: each person stays logged in as one or two roles on their own laptop and does their steps when the event reaches them. The tracker's </w:t>
       </w:r>
       <w:r>
         <w:rPr>
@@ -779,7 +779,7 @@
         <w:t xml:space="preserve">Smoke run</w:t>
       </w:r>
       <w:r>
-        <w:t xml:space="preserve"> sheet has the accounts and what to check at each step. As of sprint 3 the flow is:</w:t>
+        <w:t xml:space="preserve"> sheet says who does each step, which account to use and what to check. As of sprint 3 the flow is:</w:t>
       </w:r>
     </w:p>
     <w:p>
@@ -1255,7 +1255,7 @@
           </w:tcPr>
           <w:p>
             <w:r>
-              <w:t xml:space="preserve">The result of each step of the smoke run.</w:t>
+              <w:t xml:space="preserve">Who does each step of the smoke run, and its result.</w:t>
             </w:r>
           </w:p>
         </w:tc>

</xml_diff>